<commit_message>
v1.0 - Diagramas UML: casos de uso, actividad, secuencia, clases y despliegue
</commit_message>
<xml_diff>
--- a/docs/Documento_Tecnico.docx
+++ b/docs/Documento_Tecnico.docx
@@ -1080,7 +1080,7 @@
               <w:rPr>
                 <w:noProof/>
               </w:rPr>
-              <w:t>8</w:t>
+              <w:t>7</w:t>
             </w:r>
             <w:r>
               <w:rPr>
@@ -1263,7 +1263,7 @@
               <w:rPr>
                 <w:noProof/>
               </w:rPr>
-              <w:t>11</w:t>
+              <w:t>12</w:t>
             </w:r>
             <w:r>
               <w:rPr>
@@ -1324,7 +1324,7 @@
               <w:rPr>
                 <w:noProof/>
               </w:rPr>
-              <w:t>12</w:t>
+              <w:t>13</w:t>
             </w:r>
             <w:r>
               <w:rPr>
@@ -1385,7 +1385,7 @@
               <w:rPr>
                 <w:noProof/>
               </w:rPr>
-              <w:t>12</w:t>
+              <w:t>14</w:t>
             </w:r>
             <w:r>
               <w:rPr>
@@ -1446,7 +1446,7 @@
               <w:rPr>
                 <w:noProof/>
               </w:rPr>
-              <w:t>13</w:t>
+              <w:t>15</w:t>
             </w:r>
             <w:r>
               <w:rPr>
@@ -1507,7 +1507,7 @@
               <w:rPr>
                 <w:noProof/>
               </w:rPr>
-              <w:t>13</w:t>
+              <w:t>15</w:t>
             </w:r>
             <w:r>
               <w:rPr>
@@ -1568,7 +1568,7 @@
               <w:rPr>
                 <w:noProof/>
               </w:rPr>
-              <w:t>13</w:t>
+              <w:t>15</w:t>
             </w:r>
             <w:r>
               <w:rPr>
@@ -1629,7 +1629,7 @@
               <w:rPr>
                 <w:noProof/>
               </w:rPr>
-              <w:t>13</w:t>
+              <w:t>15</w:t>
             </w:r>
             <w:r>
               <w:rPr>
@@ -1690,7 +1690,7 @@
               <w:rPr>
                 <w:noProof/>
               </w:rPr>
-              <w:t>14</w:t>
+              <w:t>16</w:t>
             </w:r>
             <w:r>
               <w:rPr>
@@ -1751,7 +1751,7 @@
               <w:rPr>
                 <w:noProof/>
               </w:rPr>
-              <w:t>15</w:t>
+              <w:t>17</w:t>
             </w:r>
             <w:r>
               <w:rPr>
@@ -1812,7 +1812,7 @@
               <w:rPr>
                 <w:noProof/>
               </w:rPr>
-              <w:t>17</w:t>
+              <w:t>19</w:t>
             </w:r>
             <w:r>
               <w:rPr>
@@ -1873,7 +1873,7 @@
               <w:rPr>
                 <w:noProof/>
               </w:rPr>
-              <w:t>23</w:t>
+              <w:t>25</w:t>
             </w:r>
             <w:r>
               <w:rPr>
@@ -1934,7 +1934,7 @@
               <w:rPr>
                 <w:noProof/>
               </w:rPr>
-              <w:t>24</w:t>
+              <w:t>26</w:t>
             </w:r>
             <w:r>
               <w:rPr>
@@ -1995,7 +1995,7 @@
               <w:rPr>
                 <w:noProof/>
               </w:rPr>
-              <w:t>24</w:t>
+              <w:t>26</w:t>
             </w:r>
             <w:r>
               <w:rPr>
@@ -4493,10 +4493,572 @@
     </w:p>
     <w:p>
       <w:pPr>
+        <w:pStyle w:val="Ttulo1"/>
+      </w:pPr>
+      <w:r>
+        <w:t xml:space="preserve">5. </w:t>
+      </w:r>
+      <w:bookmarkStart w:id="12" w:name="_Toc243557570"/>
+      <w:r>
+        <w:t>Descripción de los workflows</w:t>
+      </w:r>
+      <w:bookmarkEnd w:id="12"/>
+    </w:p>
+    <w:p/>
+    <w:p>
+      <w:pPr>
         <w:spacing w:after="120" w:line="300" w:lineRule="auto"/>
         <w:jc w:val="both"/>
       </w:pPr>
-    </w:p>
+      <w:r>
+        <w:t>El sistema está formado por cuatro workflows que cumplen los tres tipos exigidos (ingesta, procesamiento y salida) más uno dedicado al manejo de errores.</w:t>
+      </w:r>
+    </w:p>
+    <w:tbl>
+      <w:tblPr>
+        <w:tblW w:w="9360" w:type="dxa"/>
+        <w:tblBorders>
+          <w:top w:val="single" w:sz="4" w:space="0" w:color="auto"/>
+          <w:left w:val="single" w:sz="4" w:space="0" w:color="auto"/>
+          <w:bottom w:val="single" w:sz="4" w:space="0" w:color="auto"/>
+          <w:right w:val="single" w:sz="4" w:space="0" w:color="auto"/>
+          <w:insideH w:val="single" w:sz="4" w:space="0" w:color="auto"/>
+          <w:insideV w:val="single" w:sz="4" w:space="0" w:color="auto"/>
+        </w:tblBorders>
+        <w:tblCellMar>
+          <w:left w:w="10" w:type="dxa"/>
+          <w:right w:w="10" w:type="dxa"/>
+        </w:tblCellMar>
+        <w:tblLook w:val="0000" w:firstRow="0" w:lastRow="0" w:firstColumn="0" w:lastColumn="0" w:noHBand="0" w:noVBand="0"/>
+      </w:tblPr>
+      <w:tblGrid>
+        <w:gridCol w:w="2700"/>
+        <w:gridCol w:w="1600"/>
+        <w:gridCol w:w="5060"/>
+      </w:tblGrid>
+      <w:tr>
+        <w:tblPrEx>
+          <w:tblCellMar>
+            <w:top w:w="0" w:type="dxa"/>
+            <w:bottom w:w="0" w:type="dxa"/>
+          </w:tblCellMar>
+        </w:tblPrEx>
+        <w:trPr>
+          <w:tblHeader/>
+        </w:trPr>
+        <w:tc>
+          <w:tcPr>
+            <w:tcW w:w="2700" w:type="dxa"/>
+            <w:tcBorders>
+              <w:top w:val="single" w:sz="4" w:space="0" w:color="BFBFBF"/>
+              <w:left w:val="single" w:sz="4" w:space="0" w:color="BFBFBF"/>
+              <w:bottom w:val="single" w:sz="4" w:space="0" w:color="BFBFBF"/>
+              <w:right w:val="single" w:sz="4" w:space="0" w:color="BFBFBF"/>
+            </w:tcBorders>
+            <w:shd w:val="clear" w:color="auto" w:fill="F1A983" w:themeFill="accent2" w:themeFillTint="99"/>
+            <w:tcMar>
+              <w:top w:w="60" w:type="dxa"/>
+              <w:left w:w="100" w:type="dxa"/>
+              <w:bottom w:w="60" w:type="dxa"/>
+              <w:right w:w="100" w:type="dxa"/>
+            </w:tcMar>
+          </w:tcPr>
+          <w:p>
+            <w:pPr>
+              <w:spacing w:line="260" w:lineRule="auto"/>
+            </w:pPr>
+            <w:r>
+              <w:rPr>
+                <w:b/>
+                <w:bCs/>
+                <w:color w:val="FFFFFF"/>
+                <w:sz w:val="19"/>
+                <w:szCs w:val="19"/>
+              </w:rPr>
+              <w:t>Workflow</w:t>
+            </w:r>
+          </w:p>
+        </w:tc>
+        <w:tc>
+          <w:tcPr>
+            <w:tcW w:w="1600" w:type="dxa"/>
+            <w:tcBorders>
+              <w:top w:val="single" w:sz="4" w:space="0" w:color="BFBFBF"/>
+              <w:left w:val="single" w:sz="4" w:space="0" w:color="BFBFBF"/>
+              <w:bottom w:val="single" w:sz="4" w:space="0" w:color="BFBFBF"/>
+              <w:right w:val="single" w:sz="4" w:space="0" w:color="BFBFBF"/>
+            </w:tcBorders>
+            <w:shd w:val="clear" w:color="auto" w:fill="F1A983" w:themeFill="accent2" w:themeFillTint="99"/>
+            <w:tcMar>
+              <w:top w:w="60" w:type="dxa"/>
+              <w:left w:w="100" w:type="dxa"/>
+              <w:bottom w:w="60" w:type="dxa"/>
+              <w:right w:w="100" w:type="dxa"/>
+            </w:tcMar>
+          </w:tcPr>
+          <w:p>
+            <w:pPr>
+              <w:spacing w:line="260" w:lineRule="auto"/>
+            </w:pPr>
+            <w:r>
+              <w:rPr>
+                <w:b/>
+                <w:bCs/>
+                <w:color w:val="FFFFFF"/>
+                <w:sz w:val="19"/>
+                <w:szCs w:val="19"/>
+              </w:rPr>
+              <w:t>Tipo</w:t>
+            </w:r>
+          </w:p>
+        </w:tc>
+        <w:tc>
+          <w:tcPr>
+            <w:tcW w:w="5060" w:type="dxa"/>
+            <w:tcBorders>
+              <w:top w:val="single" w:sz="4" w:space="0" w:color="BFBFBF"/>
+              <w:left w:val="single" w:sz="4" w:space="0" w:color="BFBFBF"/>
+              <w:bottom w:val="single" w:sz="4" w:space="0" w:color="BFBFBF"/>
+              <w:right w:val="single" w:sz="4" w:space="0" w:color="BFBFBF"/>
+            </w:tcBorders>
+            <w:shd w:val="clear" w:color="auto" w:fill="F1A983" w:themeFill="accent2" w:themeFillTint="99"/>
+            <w:tcMar>
+              <w:top w:w="60" w:type="dxa"/>
+              <w:left w:w="100" w:type="dxa"/>
+              <w:bottom w:w="60" w:type="dxa"/>
+              <w:right w:w="100" w:type="dxa"/>
+            </w:tcMar>
+          </w:tcPr>
+          <w:p>
+            <w:pPr>
+              <w:spacing w:line="260" w:lineRule="auto"/>
+            </w:pPr>
+            <w:r>
+              <w:rPr>
+                <w:b/>
+                <w:bCs/>
+                <w:color w:val="FFFFFF"/>
+                <w:sz w:val="19"/>
+                <w:szCs w:val="19"/>
+              </w:rPr>
+              <w:t>Qué hace</w:t>
+            </w:r>
+          </w:p>
+        </w:tc>
+      </w:tr>
+      <w:tr>
+        <w:tblPrEx>
+          <w:tblCellMar>
+            <w:top w:w="0" w:type="dxa"/>
+            <w:bottom w:w="0" w:type="dxa"/>
+          </w:tblCellMar>
+        </w:tblPrEx>
+        <w:tc>
+          <w:tcPr>
+            <w:tcW w:w="2700" w:type="dxa"/>
+            <w:tcBorders>
+              <w:top w:val="single" w:sz="4" w:space="0" w:color="BFBFBF"/>
+              <w:left w:val="single" w:sz="4" w:space="0" w:color="BFBFBF"/>
+              <w:bottom w:val="single" w:sz="4" w:space="0" w:color="BFBFBF"/>
+              <w:right w:val="single" w:sz="4" w:space="0" w:color="BFBFBF"/>
+            </w:tcBorders>
+            <w:tcMar>
+              <w:top w:w="60" w:type="dxa"/>
+              <w:left w:w="100" w:type="dxa"/>
+              <w:bottom w:w="60" w:type="dxa"/>
+              <w:right w:w="100" w:type="dxa"/>
+            </w:tcMar>
+          </w:tcPr>
+          <w:p>
+            <w:pPr>
+              <w:spacing w:line="260" w:lineRule="auto"/>
+            </w:pPr>
+            <w:r>
+              <w:rPr>
+                <w:sz w:val="19"/>
+                <w:szCs w:val="19"/>
+              </w:rPr>
+              <w:t>WF1 – Ingesta de préstamos</w:t>
+            </w:r>
+          </w:p>
+        </w:tc>
+        <w:tc>
+          <w:tcPr>
+            <w:tcW w:w="1600" w:type="dxa"/>
+            <w:tcBorders>
+              <w:top w:val="single" w:sz="4" w:space="0" w:color="BFBFBF"/>
+              <w:left w:val="single" w:sz="4" w:space="0" w:color="BFBFBF"/>
+              <w:bottom w:val="single" w:sz="4" w:space="0" w:color="BFBFBF"/>
+              <w:right w:val="single" w:sz="4" w:space="0" w:color="BFBFBF"/>
+            </w:tcBorders>
+            <w:tcMar>
+              <w:top w:w="60" w:type="dxa"/>
+              <w:left w:w="100" w:type="dxa"/>
+              <w:bottom w:w="60" w:type="dxa"/>
+              <w:right w:w="100" w:type="dxa"/>
+            </w:tcMar>
+          </w:tcPr>
+          <w:p>
+            <w:pPr>
+              <w:spacing w:line="260" w:lineRule="auto"/>
+            </w:pPr>
+            <w:r>
+              <w:rPr>
+                <w:sz w:val="19"/>
+                <w:szCs w:val="19"/>
+              </w:rPr>
+              <w:t>Ingesta</w:t>
+            </w:r>
+          </w:p>
+        </w:tc>
+        <w:tc>
+          <w:tcPr>
+            <w:tcW w:w="5060" w:type="dxa"/>
+            <w:tcBorders>
+              <w:top w:val="single" w:sz="4" w:space="0" w:color="BFBFBF"/>
+              <w:left w:val="single" w:sz="4" w:space="0" w:color="BFBFBF"/>
+              <w:bottom w:val="single" w:sz="4" w:space="0" w:color="BFBFBF"/>
+              <w:right w:val="single" w:sz="4" w:space="0" w:color="BFBFBF"/>
+            </w:tcBorders>
+            <w:tcMar>
+              <w:top w:w="60" w:type="dxa"/>
+              <w:left w:w="100" w:type="dxa"/>
+              <w:bottom w:w="60" w:type="dxa"/>
+              <w:right w:w="100" w:type="dxa"/>
+            </w:tcMar>
+          </w:tcPr>
+          <w:p>
+            <w:pPr>
+              <w:spacing w:line="260" w:lineRule="auto"/>
+            </w:pPr>
+            <w:r>
+              <w:rPr>
+                <w:sz w:val="19"/>
+                <w:szCs w:val="19"/>
+              </w:rPr>
+              <w:t xml:space="preserve">Recibe la solicitud por un </w:t>
+            </w:r>
+            <w:proofErr w:type="spellStart"/>
+            <w:r>
+              <w:rPr>
+                <w:sz w:val="19"/>
+                <w:szCs w:val="19"/>
+              </w:rPr>
+              <w:t>webhook</w:t>
+            </w:r>
+            <w:proofErr w:type="spellEnd"/>
+            <w:r>
+              <w:rPr>
+                <w:sz w:val="19"/>
+                <w:szCs w:val="19"/>
+              </w:rPr>
+              <w:t xml:space="preserve"> protegido, valida los datos y decide si la rechaza o la envía a procesamiento.</w:t>
+            </w:r>
+          </w:p>
+        </w:tc>
+      </w:tr>
+      <w:tr>
+        <w:tblPrEx>
+          <w:tblCellMar>
+            <w:top w:w="0" w:type="dxa"/>
+            <w:bottom w:w="0" w:type="dxa"/>
+          </w:tblCellMar>
+        </w:tblPrEx>
+        <w:tc>
+          <w:tcPr>
+            <w:tcW w:w="2700" w:type="dxa"/>
+            <w:tcBorders>
+              <w:top w:val="single" w:sz="4" w:space="0" w:color="BFBFBF"/>
+              <w:left w:val="single" w:sz="4" w:space="0" w:color="BFBFBF"/>
+              <w:bottom w:val="single" w:sz="4" w:space="0" w:color="BFBFBF"/>
+              <w:right w:val="single" w:sz="4" w:space="0" w:color="BFBFBF"/>
+            </w:tcBorders>
+            <w:tcMar>
+              <w:top w:w="60" w:type="dxa"/>
+              <w:left w:w="100" w:type="dxa"/>
+              <w:bottom w:w="60" w:type="dxa"/>
+              <w:right w:w="100" w:type="dxa"/>
+            </w:tcMar>
+          </w:tcPr>
+          <w:p>
+            <w:pPr>
+              <w:spacing w:line="260" w:lineRule="auto"/>
+            </w:pPr>
+            <w:r>
+              <w:rPr>
+                <w:sz w:val="19"/>
+                <w:szCs w:val="19"/>
+              </w:rPr>
+              <w:t>WF2 – Procesamiento de préstamos</w:t>
+            </w:r>
+          </w:p>
+        </w:tc>
+        <w:tc>
+          <w:tcPr>
+            <w:tcW w:w="1600" w:type="dxa"/>
+            <w:tcBorders>
+              <w:top w:val="single" w:sz="4" w:space="0" w:color="BFBFBF"/>
+              <w:left w:val="single" w:sz="4" w:space="0" w:color="BFBFBF"/>
+              <w:bottom w:val="single" w:sz="4" w:space="0" w:color="BFBFBF"/>
+              <w:right w:val="single" w:sz="4" w:space="0" w:color="BFBFBF"/>
+            </w:tcBorders>
+            <w:tcMar>
+              <w:top w:w="60" w:type="dxa"/>
+              <w:left w:w="100" w:type="dxa"/>
+              <w:bottom w:w="60" w:type="dxa"/>
+              <w:right w:w="100" w:type="dxa"/>
+            </w:tcMar>
+          </w:tcPr>
+          <w:p>
+            <w:pPr>
+              <w:spacing w:line="260" w:lineRule="auto"/>
+            </w:pPr>
+            <w:r>
+              <w:rPr>
+                <w:sz w:val="19"/>
+                <w:szCs w:val="19"/>
+              </w:rPr>
+              <w:t>Procesamiento</w:t>
+            </w:r>
+          </w:p>
+        </w:tc>
+        <w:tc>
+          <w:tcPr>
+            <w:tcW w:w="5060" w:type="dxa"/>
+            <w:tcBorders>
+              <w:top w:val="single" w:sz="4" w:space="0" w:color="BFBFBF"/>
+              <w:left w:val="single" w:sz="4" w:space="0" w:color="BFBFBF"/>
+              <w:bottom w:val="single" w:sz="4" w:space="0" w:color="BFBFBF"/>
+              <w:right w:val="single" w:sz="4" w:space="0" w:color="BFBFBF"/>
+            </w:tcBorders>
+            <w:tcMar>
+              <w:top w:w="60" w:type="dxa"/>
+              <w:left w:w="100" w:type="dxa"/>
+              <w:bottom w:w="60" w:type="dxa"/>
+              <w:right w:w="100" w:type="dxa"/>
+            </w:tcMar>
+          </w:tcPr>
+          <w:p>
+            <w:pPr>
+              <w:spacing w:line="260" w:lineRule="auto"/>
+            </w:pPr>
+            <w:r>
+              <w:rPr>
+                <w:sz w:val="19"/>
+                <w:szCs w:val="19"/>
+              </w:rPr>
+              <w:t>Verifica el stock, registra el préstamo y descuenta el inventario en una sola operación.</w:t>
+            </w:r>
+          </w:p>
+        </w:tc>
+      </w:tr>
+      <w:tr>
+        <w:tblPrEx>
+          <w:tblCellMar>
+            <w:top w:w="0" w:type="dxa"/>
+            <w:bottom w:w="0" w:type="dxa"/>
+          </w:tblCellMar>
+        </w:tblPrEx>
+        <w:tc>
+          <w:tcPr>
+            <w:tcW w:w="2700" w:type="dxa"/>
+            <w:tcBorders>
+              <w:top w:val="single" w:sz="4" w:space="0" w:color="BFBFBF"/>
+              <w:left w:val="single" w:sz="4" w:space="0" w:color="BFBFBF"/>
+              <w:bottom w:val="single" w:sz="4" w:space="0" w:color="BFBFBF"/>
+              <w:right w:val="single" w:sz="4" w:space="0" w:color="BFBFBF"/>
+            </w:tcBorders>
+            <w:tcMar>
+              <w:top w:w="60" w:type="dxa"/>
+              <w:left w:w="100" w:type="dxa"/>
+              <w:bottom w:w="60" w:type="dxa"/>
+              <w:right w:w="100" w:type="dxa"/>
+            </w:tcMar>
+          </w:tcPr>
+          <w:p>
+            <w:pPr>
+              <w:spacing w:line="260" w:lineRule="auto"/>
+            </w:pPr>
+            <w:r>
+              <w:rPr>
+                <w:sz w:val="19"/>
+                <w:szCs w:val="19"/>
+              </w:rPr>
+              <w:t>WF3 – Salida de reportes</w:t>
+            </w:r>
+          </w:p>
+        </w:tc>
+        <w:tc>
+          <w:tcPr>
+            <w:tcW w:w="1600" w:type="dxa"/>
+            <w:tcBorders>
+              <w:top w:val="single" w:sz="4" w:space="0" w:color="BFBFBF"/>
+              <w:left w:val="single" w:sz="4" w:space="0" w:color="BFBFBF"/>
+              <w:bottom w:val="single" w:sz="4" w:space="0" w:color="BFBFBF"/>
+              <w:right w:val="single" w:sz="4" w:space="0" w:color="BFBFBF"/>
+            </w:tcBorders>
+            <w:tcMar>
+              <w:top w:w="60" w:type="dxa"/>
+              <w:left w:w="100" w:type="dxa"/>
+              <w:bottom w:w="60" w:type="dxa"/>
+              <w:right w:w="100" w:type="dxa"/>
+            </w:tcMar>
+          </w:tcPr>
+          <w:p>
+            <w:pPr>
+              <w:spacing w:line="260" w:lineRule="auto"/>
+            </w:pPr>
+            <w:r>
+              <w:rPr>
+                <w:sz w:val="19"/>
+                <w:szCs w:val="19"/>
+              </w:rPr>
+              <w:t>Salida</w:t>
+            </w:r>
+          </w:p>
+        </w:tc>
+        <w:tc>
+          <w:tcPr>
+            <w:tcW w:w="5060" w:type="dxa"/>
+            <w:tcBorders>
+              <w:top w:val="single" w:sz="4" w:space="0" w:color="BFBFBF"/>
+              <w:left w:val="single" w:sz="4" w:space="0" w:color="BFBFBF"/>
+              <w:bottom w:val="single" w:sz="4" w:space="0" w:color="BFBFBF"/>
+              <w:right w:val="single" w:sz="4" w:space="0" w:color="BFBFBF"/>
+            </w:tcBorders>
+            <w:tcMar>
+              <w:top w:w="60" w:type="dxa"/>
+              <w:left w:w="100" w:type="dxa"/>
+              <w:bottom w:w="60" w:type="dxa"/>
+              <w:right w:w="100" w:type="dxa"/>
+            </w:tcMar>
+          </w:tcPr>
+          <w:p>
+            <w:pPr>
+              <w:spacing w:line="260" w:lineRule="auto"/>
+            </w:pPr>
+            <w:r>
+              <w:rPr>
+                <w:sz w:val="19"/>
+                <w:szCs w:val="19"/>
+              </w:rPr>
+              <w:t>Cada día a las 7:00 a. m. marca los préstamos vencidos y genera un reporte en la base de datos y en un archivo CSV.</w:t>
+            </w:r>
+          </w:p>
+        </w:tc>
+      </w:tr>
+      <w:tr>
+        <w:tblPrEx>
+          <w:tblCellMar>
+            <w:top w:w="0" w:type="dxa"/>
+            <w:bottom w:w="0" w:type="dxa"/>
+          </w:tblCellMar>
+        </w:tblPrEx>
+        <w:tc>
+          <w:tcPr>
+            <w:tcW w:w="2700" w:type="dxa"/>
+            <w:tcBorders>
+              <w:top w:val="single" w:sz="4" w:space="0" w:color="BFBFBF"/>
+              <w:left w:val="single" w:sz="4" w:space="0" w:color="BFBFBF"/>
+              <w:bottom w:val="single" w:sz="4" w:space="0" w:color="BFBFBF"/>
+              <w:right w:val="single" w:sz="4" w:space="0" w:color="BFBFBF"/>
+            </w:tcBorders>
+            <w:tcMar>
+              <w:top w:w="60" w:type="dxa"/>
+              <w:left w:w="100" w:type="dxa"/>
+              <w:bottom w:w="60" w:type="dxa"/>
+              <w:right w:w="100" w:type="dxa"/>
+            </w:tcMar>
+          </w:tcPr>
+          <w:p>
+            <w:pPr>
+              <w:spacing w:line="260" w:lineRule="auto"/>
+            </w:pPr>
+            <w:r>
+              <w:rPr>
+                <w:sz w:val="19"/>
+                <w:szCs w:val="19"/>
+              </w:rPr>
+              <w:t>WF4 – Manejo de errores</w:t>
+            </w:r>
+          </w:p>
+        </w:tc>
+        <w:tc>
+          <w:tcPr>
+            <w:tcW w:w="1600" w:type="dxa"/>
+            <w:tcBorders>
+              <w:top w:val="single" w:sz="4" w:space="0" w:color="BFBFBF"/>
+              <w:left w:val="single" w:sz="4" w:space="0" w:color="BFBFBF"/>
+              <w:bottom w:val="single" w:sz="4" w:space="0" w:color="BFBFBF"/>
+              <w:right w:val="single" w:sz="4" w:space="0" w:color="BFBFBF"/>
+            </w:tcBorders>
+            <w:tcMar>
+              <w:top w:w="60" w:type="dxa"/>
+              <w:left w:w="100" w:type="dxa"/>
+              <w:bottom w:w="60" w:type="dxa"/>
+              <w:right w:w="100" w:type="dxa"/>
+            </w:tcMar>
+          </w:tcPr>
+          <w:p>
+            <w:pPr>
+              <w:spacing w:line="260" w:lineRule="auto"/>
+            </w:pPr>
+            <w:r>
+              <w:rPr>
+                <w:sz w:val="19"/>
+                <w:szCs w:val="19"/>
+              </w:rPr>
+              <w:t>Errores</w:t>
+            </w:r>
+          </w:p>
+        </w:tc>
+        <w:tc>
+          <w:tcPr>
+            <w:tcW w:w="5060" w:type="dxa"/>
+            <w:tcBorders>
+              <w:top w:val="single" w:sz="4" w:space="0" w:color="BFBFBF"/>
+              <w:left w:val="single" w:sz="4" w:space="0" w:color="BFBFBF"/>
+              <w:bottom w:val="single" w:sz="4" w:space="0" w:color="BFBFBF"/>
+              <w:right w:val="single" w:sz="4" w:space="0" w:color="BFBFBF"/>
+            </w:tcBorders>
+            <w:tcMar>
+              <w:top w:w="60" w:type="dxa"/>
+              <w:left w:w="100" w:type="dxa"/>
+              <w:bottom w:w="60" w:type="dxa"/>
+              <w:right w:w="100" w:type="dxa"/>
+            </w:tcMar>
+          </w:tcPr>
+          <w:p>
+            <w:pPr>
+              <w:spacing w:line="260" w:lineRule="auto"/>
+            </w:pPr>
+            <w:r>
+              <w:rPr>
+                <w:sz w:val="19"/>
+                <w:szCs w:val="19"/>
+              </w:rPr>
+              <w:t xml:space="preserve">Se activa cuando falla cualquier otro </w:t>
+            </w:r>
+            <w:proofErr w:type="spellStart"/>
+            <w:r>
+              <w:rPr>
+                <w:sz w:val="19"/>
+                <w:szCs w:val="19"/>
+              </w:rPr>
+              <w:t>workflow</w:t>
+            </w:r>
+            <w:proofErr w:type="spellEnd"/>
+            <w:r>
+              <w:rPr>
+                <w:sz w:val="19"/>
+                <w:szCs w:val="19"/>
+              </w:rPr>
+              <w:t xml:space="preserve"> y registra el error.</w:t>
+            </w:r>
+          </w:p>
+        </w:tc>
+      </w:tr>
+    </w:tbl>
     <w:p>
       <w:pPr>
         <w:spacing w:after="120" w:line="300" w:lineRule="auto"/>
@@ -4508,71 +5070,9 @@
         <w:spacing w:after="120" w:line="300" w:lineRule="auto"/>
         <w:jc w:val="both"/>
       </w:pPr>
-    </w:p>
-    <w:p>
-      <w:pPr>
-        <w:spacing w:after="120" w:line="300" w:lineRule="auto"/>
-        <w:jc w:val="both"/>
-      </w:pPr>
-    </w:p>
-    <w:p>
-      <w:pPr>
-        <w:spacing w:after="120" w:line="300" w:lineRule="auto"/>
-        <w:jc w:val="both"/>
-      </w:pPr>
-    </w:p>
-    <w:p>
-      <w:pPr>
-        <w:spacing w:after="120" w:line="300" w:lineRule="auto"/>
-        <w:jc w:val="both"/>
-      </w:pPr>
-    </w:p>
-    <w:p>
-      <w:pPr>
-        <w:spacing w:after="120" w:line="300" w:lineRule="auto"/>
-        <w:jc w:val="both"/>
-      </w:pPr>
-    </w:p>
-    <w:p>
-      <w:pPr>
-        <w:spacing w:after="120" w:line="300" w:lineRule="auto"/>
-        <w:jc w:val="both"/>
-      </w:pPr>
-    </w:p>
-    <w:p>
-      <w:pPr>
-        <w:spacing w:after="120" w:line="300" w:lineRule="auto"/>
-        <w:jc w:val="both"/>
-      </w:pPr>
-    </w:p>
-    <w:p>
-      <w:pPr>
-        <w:spacing w:after="120" w:line="300" w:lineRule="auto"/>
-        <w:jc w:val="both"/>
-      </w:pPr>
-    </w:p>
-    <w:p>
-      <w:pPr>
-        <w:pStyle w:val="Ttulo1"/>
-      </w:pPr>
       <w:r>
         <w:lastRenderedPageBreak/>
-        <w:t xml:space="preserve">5. </w:t>
-      </w:r>
-      <w:bookmarkStart w:id="12" w:name="_Toc243557570"/>
-      <w:r>
-        <w:t>Descripción de los workflows</w:t>
-      </w:r>
-      <w:bookmarkEnd w:id="12"/>
-    </w:p>
-    <w:p/>
-    <w:p>
-      <w:pPr>
-        <w:spacing w:after="120" w:line="300" w:lineRule="auto"/>
-        <w:jc w:val="both"/>
-      </w:pPr>
-      <w:r>
-        <w:t>El sistema está formado por cuatro workflows que cumplen los tres tipos exigidos (ingesta, procesamiento y salida) más uno dedicado al manejo de errores.</w:t>
+        <w:t>La solución automatiza el proceso completo con cuatro workflows de n8n que trabajan sobre una base de datos PostgreSQL, ambos ejecutándose en contenedores Docker:</w:t>
       </w:r>
     </w:p>
     <w:p>
@@ -4587,12 +5087,25 @@
           <w:szCs w:val="18"/>
         </w:rPr>
       </w:pPr>
+    </w:p>
+    <w:p>
+      <w:pPr>
+        <w:spacing w:after="200"/>
+        <w:jc w:val="center"/>
+        <w:rPr>
+          <w:i/>
+          <w:iCs/>
+          <w:color w:val="595959"/>
+          <w:sz w:val="18"/>
+          <w:szCs w:val="18"/>
+        </w:rPr>
+      </w:pPr>
       <w:r>
         <w:rPr>
           <w:noProof/>
         </w:rPr>
         <w:drawing>
-          <wp:inline distT="0" distB="0" distL="0" distR="0" wp14:anchorId="16B74C1D" wp14:editId="3D018C10">
+          <wp:inline distT="0" distB="0" distL="0" distR="0" wp14:anchorId="16B74C1D" wp14:editId="5E5A7788">
             <wp:extent cx="2421255" cy="6774180"/>
             <wp:effectExtent l="0" t="0" r="0" b="7620"/>
             <wp:docPr id="3" name="Imagen 3"/>
@@ -4685,7 +5198,96 @@
         <w:jc w:val="both"/>
       </w:pPr>
       <w:r>
+        <w:rPr>
+          <w:b/>
+          <w:bCs/>
+        </w:rPr>
+        <w:t xml:space="preserve">Objetivo: </w:t>
+      </w:r>
+      <w:r>
+        <w:t xml:space="preserve">ser la única puerta de entrada al sistema. Ninguna solicitud llega a la base de datos sin pasar antes por este </w:t>
+      </w:r>
+      <w:proofErr w:type="spellStart"/>
+      <w:r>
+        <w:t>workflow</w:t>
+      </w:r>
+      <w:proofErr w:type="spellEnd"/>
+      <w:r>
+        <w:t>.</w:t>
+      </w:r>
+    </w:p>
+    <w:p>
+      <w:pPr>
+        <w:spacing w:after="120" w:line="300" w:lineRule="auto"/>
+        <w:jc w:val="both"/>
+      </w:pPr>
+      <w:r>
+        <w:rPr>
+          <w:b/>
+          <w:bCs/>
+        </w:rPr>
+        <w:t xml:space="preserve">Disparador: </w:t>
+      </w:r>
+      <w:r>
+        <w:t xml:space="preserve">nodo </w:t>
+      </w:r>
+      <w:proofErr w:type="spellStart"/>
+      <w:r>
+        <w:t>Webhook</w:t>
+      </w:r>
+      <w:proofErr w:type="spellEnd"/>
+      <w:r>
+        <w:t xml:space="preserve"> que recibe peticiones POST en /</w:t>
+      </w:r>
+      <w:proofErr w:type="spellStart"/>
+      <w:r>
+        <w:t>webhook</w:t>
+      </w:r>
+      <w:proofErr w:type="spellEnd"/>
+      <w:r>
+        <w:t>/prestamos. Exige la cabecera X-API-Key (</w:t>
+      </w:r>
+      <w:proofErr w:type="spellStart"/>
+      <w:r>
+        <w:t>Header</w:t>
+      </w:r>
+      <w:proofErr w:type="spellEnd"/>
+      <w:r>
+        <w:t xml:space="preserve"> </w:t>
+      </w:r>
+      <w:proofErr w:type="spellStart"/>
+      <w:r>
+        <w:t>Auth</w:t>
+      </w:r>
+      <w:proofErr w:type="spellEnd"/>
+      <w:r>
+        <w:t xml:space="preserve">): sin la clave correcta, n8n responde 403 y el </w:t>
+      </w:r>
+      <w:proofErr w:type="spellStart"/>
+      <w:r>
+        <w:t>workflow</w:t>
+      </w:r>
+      <w:proofErr w:type="spellEnd"/>
+      <w:r>
+        <w:t xml:space="preserve"> ni siquiera se ejecuta.</w:t>
+      </w:r>
+    </w:p>
+    <w:p/>
+    <w:p>
+      <w:pPr>
+        <w:spacing w:after="120" w:line="300" w:lineRule="auto"/>
+        <w:jc w:val="both"/>
+      </w:pPr>
+      <w:r>
         <w:t>Es la puerta de entrada del sistema. Recibe la solicitud por HTTP, comprueba la clave de acceso, valida los datos y decide si la rechaza o la envía a procesamiento.</w:t>
+      </w:r>
+    </w:p>
+    <w:p>
+      <w:pPr>
+        <w:pStyle w:val="Ttulo2"/>
+      </w:pPr>
+      <w:r>
+        <w:t>3.1 Nodos</w:t>
       </w:r>
     </w:p>
     <w:tbl>
@@ -5596,6 +6198,14 @@
     </w:p>
     <w:p>
       <w:pPr>
+        <w:pStyle w:val="Ttulo2"/>
+      </w:pPr>
+      <w:r>
+        <w:t>3.2 Reglas de validación</w:t>
+      </w:r>
+    </w:p>
+    <w:p>
+      <w:pPr>
         <w:spacing w:after="120" w:line="300" w:lineRule="auto"/>
         <w:jc w:val="both"/>
       </w:pPr>
@@ -6034,6 +6644,7 @@
           <w:iCs/>
           <w:noProof/>
         </w:rPr>
+        <w:lastRenderedPageBreak/>
         <w:drawing>
           <wp:inline distT="0" distB="0" distL="0" distR="0" wp14:anchorId="54A011AD" wp14:editId="052FAF22">
             <wp:extent cx="5943600" cy="2903220"/>
@@ -6094,7 +6705,6 @@
       </w:pPr>
       <w:bookmarkStart w:id="14" w:name="_Toc243557572"/>
       <w:r>
-        <w:lastRenderedPageBreak/>
         <w:t>5.2 WF2 – Procesamiento de préstamos</w:t>
       </w:r>
       <w:bookmarkEnd w:id="14"/>
@@ -6106,7 +6716,14 @@
         <w:jc w:val="both"/>
       </w:pPr>
       <w:r>
-        <w:t>Solo puede ejecutarse desde el WF1, nunca directamente desde fuera. Su nodo central ejecuta una única consulta SQL que descuenta el stock solo si alcanza y, en la misma instrucción, registra el préstamo:</w:t>
+        <w:rPr>
+          <w:b/>
+          <w:bCs/>
+        </w:rPr>
+        <w:t xml:space="preserve">Objetivo: </w:t>
+      </w:r>
+      <w:r>
+        <w:t>decidir si el préstamo se puede entregar y, si se puede, registrarlo sin dejar el inventario inconsistente.</w:t>
       </w:r>
     </w:p>
     <w:p>
@@ -6114,6 +6731,60 @@
         <w:spacing w:after="120" w:line="300" w:lineRule="auto"/>
         <w:jc w:val="both"/>
       </w:pPr>
+      <w:proofErr w:type="spellStart"/>
+      <w:r>
+        <w:rPr>
+          <w:b/>
+          <w:bCs/>
+          <w:lang w:val="en-US"/>
+        </w:rPr>
+        <w:t>Disparador</w:t>
+      </w:r>
+      <w:proofErr w:type="spellEnd"/>
+      <w:r>
+        <w:rPr>
+          <w:b/>
+          <w:bCs/>
+          <w:lang w:val="en-US"/>
+        </w:rPr>
+        <w:t xml:space="preserve">: </w:t>
+      </w:r>
+      <w:proofErr w:type="spellStart"/>
+      <w:r>
+        <w:rPr>
+          <w:lang w:val="en-US"/>
+        </w:rPr>
+        <w:t>nodo</w:t>
+      </w:r>
+      <w:proofErr w:type="spellEnd"/>
+      <w:r>
+        <w:rPr>
+          <w:lang w:val="en-US"/>
+        </w:rPr>
+        <w:t xml:space="preserve"> When Executed by Another Workflow. </w:t>
+      </w:r>
+      <w:r>
+        <w:t>Solo se ejecuta cuando lo llama el WF1, por lo que nadie puede usarlo desde afuera para saltarse la validación.</w:t>
+      </w:r>
+    </w:p>
+    <w:p>
+      <w:pPr>
+        <w:spacing w:after="120" w:line="300" w:lineRule="auto"/>
+        <w:jc w:val="both"/>
+      </w:pPr>
+      <w:r>
+        <w:t>Su nodo central ejecuta una única consulta SQL que descuenta el stock solo si alcanza y, en la misma instrucción, registra el préstamo. Al ser una sola operación, PostgreSQL la trata como una transacción: si dos personas piden el último equipo al mismo tiempo, solo una lo obtiene, y si algo falla no se guarda nada a medias. Los datos del estudiante viajan como parámetros separados del SQL, lo que evita la inyección SQL.</w:t>
+      </w:r>
+    </w:p>
+    <w:p/>
+    <w:p>
+      <w:pPr>
+        <w:spacing w:after="120" w:line="300" w:lineRule="auto"/>
+        <w:jc w:val="both"/>
+      </w:pPr>
+      <w:r>
+        <w:t>Solo puede ejecutarse desde el WF1, nunca directamente desde fuera. Su nodo central ejecuta una única consulta SQL que descuenta el stock solo si alcanza y, en la misma instrucción, registra el préstamo:</w:t>
+      </w:r>
     </w:p>
     <w:p>
       <w:pPr>
@@ -6463,6 +7134,9 @@
       <w:pPr>
         <w:shd w:val="clear" w:color="auto" w:fill="F2F2F2"/>
         <w:ind w:left="240"/>
+        <w:rPr>
+          <w:lang w:val="en-US"/>
+        </w:rPr>
       </w:pPr>
       <w:r>
         <w:rPr>
@@ -6477,6 +7151,7 @@
           <w:rFonts w:ascii="Consolas" w:eastAsia="Consolas" w:hAnsi="Consolas" w:cs="Consolas"/>
           <w:sz w:val="17"/>
           <w:szCs w:val="17"/>
+          <w:lang w:val="en-US"/>
         </w:rPr>
         <w:t xml:space="preserve">SELECT $3, $4, </w:t>
       </w:r>
@@ -6486,6 +7161,7 @@
           <w:rFonts w:ascii="Consolas" w:eastAsia="Consolas" w:hAnsi="Consolas" w:cs="Consolas"/>
           <w:sz w:val="17"/>
           <w:szCs w:val="17"/>
+          <w:lang w:val="en-US"/>
         </w:rPr>
         <w:t>id_equipo</w:t>
       </w:r>
@@ -6495,6 +7171,7 @@
           <w:rFonts w:ascii="Consolas" w:eastAsia="Consolas" w:hAnsi="Consolas" w:cs="Consolas"/>
           <w:sz w:val="17"/>
           <w:szCs w:val="17"/>
+          <w:lang w:val="en-US"/>
         </w:rPr>
         <w:t>, $2, $</w:t>
       </w:r>
@@ -6504,6 +7181,7 @@
           <w:rFonts w:ascii="Consolas" w:eastAsia="Consolas" w:hAnsi="Consolas" w:cs="Consolas"/>
           <w:sz w:val="17"/>
           <w:szCs w:val="17"/>
+          <w:lang w:val="en-US"/>
         </w:rPr>
         <w:t>5::</w:t>
       </w:r>
@@ -6513,9 +7191,21 @@
           <w:rFonts w:ascii="Consolas" w:eastAsia="Consolas" w:hAnsi="Consolas" w:cs="Consolas"/>
           <w:sz w:val="17"/>
           <w:szCs w:val="17"/>
+          <w:lang w:val="en-US"/>
         </w:rPr>
-        <w:t>date FROM equipo</w:t>
-      </w:r>
+        <w:t xml:space="preserve">date FROM </w:t>
+      </w:r>
+      <w:proofErr w:type="spellStart"/>
+      <w:r>
+        <w:rPr>
+          <w:rFonts w:ascii="Consolas" w:eastAsia="Consolas" w:hAnsi="Consolas" w:cs="Consolas"/>
+          <w:sz w:val="17"/>
+          <w:szCs w:val="17"/>
+          <w:lang w:val="en-US"/>
+        </w:rPr>
+        <w:t>equipo</w:t>
+      </w:r>
+      <w:proofErr w:type="spellEnd"/>
     </w:p>
     <w:p>
       <w:pPr>
@@ -6530,6 +7220,7 @@
           <w:rFonts w:ascii="Consolas" w:eastAsia="Consolas" w:hAnsi="Consolas" w:cs="Consolas"/>
           <w:sz w:val="17"/>
           <w:szCs w:val="17"/>
+          <w:lang w:val="en-US"/>
         </w:rPr>
         <w:t xml:space="preserve">  </w:t>
       </w:r>
@@ -6671,6 +7362,14 @@
       </w:pPr>
       <w:r>
         <w:t>Como todo ocurre en una sola instrucción, PostgreSQL la ejecuta como una transacción: si dos solicitudes compiten por la última unidad, solo una la obtiene, y si algo falla no se guarda nada a medias.</w:t>
+      </w:r>
+    </w:p>
+    <w:p>
+      <w:pPr>
+        <w:pStyle w:val="Ttulo2"/>
+      </w:pPr>
+      <w:r>
+        <w:t>4.1 Nodos</w:t>
       </w:r>
     </w:p>
     <w:p>
@@ -7605,6 +8304,13 @@
       <w:pPr>
         <w:spacing w:after="200"/>
         <w:jc w:val="center"/>
+        <w:rPr>
+          <w:i/>
+          <w:iCs/>
+          <w:color w:val="595959"/>
+          <w:sz w:val="18"/>
+          <w:szCs w:val="18"/>
+        </w:rPr>
       </w:pPr>
       <w:r>
         <w:rPr>
@@ -7612,11 +8318,10 @@
           <w:iCs/>
           <w:noProof/>
         </w:rPr>
-        <w:lastRenderedPageBreak/>
         <w:drawing>
-          <wp:inline distT="0" distB="0" distL="0" distR="0" wp14:anchorId="0742F3F5" wp14:editId="71D2E567">
-            <wp:extent cx="5943600" cy="4120515"/>
-            <wp:effectExtent l="0" t="0" r="0" b="0"/>
+          <wp:inline distT="0" distB="0" distL="0" distR="0" wp14:anchorId="0742F3F5" wp14:editId="00E4AC49">
+            <wp:extent cx="5941089" cy="3470400"/>
+            <wp:effectExtent l="0" t="0" r="2540" b="0"/>
             <wp:docPr id="5" name="Imagen 5"/>
             <wp:cNvGraphicFramePr>
               <a:graphicFrameLocks xmlns:a="http://schemas.openxmlformats.org/drawingml/2006/main" noChangeAspect="1"/>
@@ -7637,7 +8342,7 @@
                   <pic:spPr>
                     <a:xfrm>
                       <a:off x="0" y="0"/>
-                      <a:ext cx="5943600" cy="4120515"/>
+                      <a:ext cx="5968020" cy="3486132"/>
                     </a:xfrm>
                     <a:prstGeom prst="rect">
                       <a:avLst/>
@@ -7669,6 +8374,12 @@
     </w:p>
     <w:p>
       <w:pPr>
+        <w:spacing w:after="200"/>
+        <w:jc w:val="center"/>
+      </w:pPr>
+    </w:p>
+    <w:p>
+      <w:pPr>
         <w:pStyle w:val="Ttulo2"/>
       </w:pPr>
       <w:bookmarkStart w:id="15" w:name="_Toc243557573"/>
@@ -7683,8 +8394,91 @@
         <w:jc w:val="both"/>
       </w:pPr>
       <w:r>
+        <w:rPr>
+          <w:b/>
+          <w:bCs/>
+        </w:rPr>
+        <w:t xml:space="preserve">Objetivo: </w:t>
+      </w:r>
+      <w:r>
+        <w:t>dar seguimiento a los préstamos sin que nadie tenga que revisar el cuaderno: detectar los equipos que no se devolvieron a tiempo y dejar un reporte verificable.</w:t>
+      </w:r>
+    </w:p>
+    <w:p>
+      <w:pPr>
+        <w:spacing w:after="120" w:line="300" w:lineRule="auto"/>
+        <w:jc w:val="both"/>
+      </w:pPr>
+      <w:r>
+        <w:rPr>
+          <w:b/>
+          <w:bCs/>
+        </w:rPr>
+        <w:t xml:space="preserve">Disparador: </w:t>
+      </w:r>
+      <w:r>
+        <w:t xml:space="preserve">nodo Schedule </w:t>
+      </w:r>
+      <w:proofErr w:type="spellStart"/>
+      <w:r>
+        <w:t>Trigger</w:t>
+      </w:r>
+      <w:proofErr w:type="spellEnd"/>
+      <w:r>
+        <w:t xml:space="preserve"> que lo ejecuta todos los días a las 7:00 a. m. (hora de Guatemala).</w:t>
+      </w:r>
+    </w:p>
+    <w:p>
+      <w:pPr>
+        <w:spacing w:after="120" w:line="300" w:lineRule="auto"/>
+        <w:jc w:val="both"/>
+      </w:pPr>
+      <w:r>
+        <w:t xml:space="preserve">El </w:t>
+      </w:r>
+      <w:proofErr w:type="spellStart"/>
+      <w:r>
+        <w:t>workflow</w:t>
+      </w:r>
+      <w:proofErr w:type="spellEnd"/>
+      <w:r>
+        <w:t xml:space="preserve"> marca como VENCIDO todo préstamo activo cuya fecha de devolución ya pasó y genera dos salidas: un registro con el reporte completo en la tabla auditoria y un archivo CSV en la carpeta reportes, con el nombre reporte_vencidos_AAAA-MM-DD.csv, que se puede abrir en Excel. Si un día no hay vencidos, el reporte se genera igual indicando "Sin préstamos vencidos".</w:t>
+      </w:r>
+    </w:p>
+    <w:p>
+      <w:pPr>
+        <w:spacing w:after="120" w:line="300" w:lineRule="auto"/>
+        <w:jc w:val="both"/>
+      </w:pPr>
+      <w:r>
         <w:t>Se ejecuta automáticamente todos los días a las 7:00 a. m. Marca como VENCIDO todo préstamo activo cuya fecha de devolución ya pasó y produce un reporte con dos salidas verificables: un registro en la tabla auditoria y un archivo CSV en la carpeta reportes/, con el nombre reporte_vencidos_AAAA-MM-DD.csv.</w:t>
       </w:r>
+    </w:p>
+    <w:p>
+      <w:pPr>
+        <w:spacing w:after="120" w:line="300" w:lineRule="auto"/>
+        <w:jc w:val="both"/>
+      </w:pPr>
+    </w:p>
+    <w:p>
+      <w:pPr>
+        <w:spacing w:after="120" w:line="300" w:lineRule="auto"/>
+        <w:jc w:val="both"/>
+      </w:pPr>
+    </w:p>
+    <w:p>
+      <w:pPr>
+        <w:pStyle w:val="Ttulo2"/>
+      </w:pPr>
+      <w:r>
+        <w:t>5.1 Nodos</w:t>
+      </w:r>
+    </w:p>
+    <w:p>
+      <w:pPr>
+        <w:spacing w:after="120" w:line="300" w:lineRule="auto"/>
+        <w:jc w:val="both"/>
+      </w:pPr>
     </w:p>
     <w:tbl>
       <w:tblPr>
@@ -8680,6 +9474,70 @@
         <w:jc w:val="both"/>
       </w:pPr>
       <w:r>
+        <w:rPr>
+          <w:b/>
+          <w:bCs/>
+        </w:rPr>
+        <w:t xml:space="preserve">Objetivo: </w:t>
+      </w:r>
+      <w:r>
+        <w:t>que ningún fallo pase desapercibido.</w:t>
+      </w:r>
+    </w:p>
+    <w:p>
+      <w:pPr>
+        <w:spacing w:after="120" w:line="300" w:lineRule="auto"/>
+        <w:jc w:val="both"/>
+      </w:pPr>
+    </w:p>
+    <w:p>
+      <w:pPr>
+        <w:spacing w:after="120" w:line="300" w:lineRule="auto"/>
+        <w:jc w:val="both"/>
+      </w:pPr>
+      <w:r>
+        <w:rPr>
+          <w:b/>
+          <w:bCs/>
+        </w:rPr>
+        <w:t xml:space="preserve">Disparador: </w:t>
+      </w:r>
+      <w:r>
+        <w:t xml:space="preserve">nodo Error </w:t>
+      </w:r>
+      <w:proofErr w:type="spellStart"/>
+      <w:r>
+        <w:t>Trigger</w:t>
+      </w:r>
+      <w:proofErr w:type="spellEnd"/>
+      <w:r>
+        <w:t>. Está configurado como Error Workflow del WF1, el WF2 y el WF3, así que n8n lo ejecuta automáticamente cuando cualquiera de ellos falla.</w:t>
+      </w:r>
+    </w:p>
+    <w:p>
+      <w:pPr>
+        <w:spacing w:after="120" w:line="300" w:lineRule="auto"/>
+        <w:jc w:val="both"/>
+      </w:pPr>
+      <w:r>
+        <w:t xml:space="preserve">Registra en la tabla errores el </w:t>
+      </w:r>
+      <w:proofErr w:type="spellStart"/>
+      <w:r>
+        <w:t>workflow</w:t>
+      </w:r>
+      <w:proofErr w:type="spellEnd"/>
+      <w:r>
+        <w:t>, el nodo exacto que falló, el mensaje, el número de ejecución y el detalle técnico. Como el WF1 llama al WF2, un fallo en el WF2 queda registrado dos veces: donde se originó y donde se recibió. Así se puede seguir el recorrido completo del error.</w:t>
+      </w:r>
+    </w:p>
+    <w:p/>
+    <w:p>
+      <w:pPr>
+        <w:spacing w:after="120" w:line="300" w:lineRule="auto"/>
+        <w:jc w:val="both"/>
+      </w:pPr>
+      <w:r>
         <w:t>Está configurado como Error Workflow del WF1, el WF2 y el WF3. Cuando cualquiera de ellos falla en una ejecución de producción, n8n lo activa automáticamente con el detalle del error.</w:t>
       </w:r>
     </w:p>
@@ -8744,6 +9602,7 @@
                 <w:sz w:val="19"/>
                 <w:szCs w:val="19"/>
               </w:rPr>
+              <w:lastRenderedPageBreak/>
               <w:t>Nodo</w:t>
             </w:r>
           </w:p>
@@ -9067,6 +9926,53 @@
     </w:p>
     <w:p>
       <w:pPr>
+        <w:spacing w:after="60"/>
+      </w:pPr>
+    </w:p>
+    <w:p>
+      <w:pPr>
+        <w:spacing w:after="60"/>
+      </w:pPr>
+      <w:r>
+        <w:drawing>
+          <wp:inline distT="0" distB="0" distL="0" distR="0" wp14:anchorId="7845FF2E" wp14:editId="1EBEEC66">
+            <wp:extent cx="5943600" cy="2649855"/>
+            <wp:effectExtent l="0" t="0" r="0" b="0"/>
+            <wp:docPr id="18" name="Imagen 18"/>
+            <wp:cNvGraphicFramePr>
+              <a:graphicFrameLocks xmlns:a="http://schemas.openxmlformats.org/drawingml/2006/main" noChangeAspect="1"/>
+            </wp:cNvGraphicFramePr>
+            <a:graphic xmlns:a="http://schemas.openxmlformats.org/drawingml/2006/main">
+              <a:graphicData uri="http://schemas.openxmlformats.org/drawingml/2006/picture">
+                <pic:pic xmlns:pic="http://schemas.openxmlformats.org/drawingml/2006/picture">
+                  <pic:nvPicPr>
+                    <pic:cNvPr id="1" name=""/>
+                    <pic:cNvPicPr/>
+                  </pic:nvPicPr>
+                  <pic:blipFill>
+                    <a:blip r:embed="rId15"/>
+                    <a:stretch>
+                      <a:fillRect/>
+                    </a:stretch>
+                  </pic:blipFill>
+                  <pic:spPr>
+                    <a:xfrm>
+                      <a:off x="0" y="0"/>
+                      <a:ext cx="5943600" cy="2649855"/>
+                    </a:xfrm>
+                    <a:prstGeom prst="rect">
+                      <a:avLst/>
+                    </a:prstGeom>
+                  </pic:spPr>
+                </pic:pic>
+              </a:graphicData>
+            </a:graphic>
+          </wp:inline>
+        </w:drawing>
+      </w:r>
+    </w:p>
+    <w:p>
+      <w:pPr>
         <w:pStyle w:val="Ttulo2"/>
       </w:pPr>
       <w:bookmarkStart w:id="17" w:name="_Toc243557575"/>
@@ -9113,39 +10019,103 @@
       </w:r>
       <w:proofErr w:type="spellEnd"/>
       <w:r>
+        <w:t xml:space="preserve"> to </w:t>
+      </w:r>
+      <w:proofErr w:type="spellStart"/>
+      <w:r>
+        <w:t>Webhook</w:t>
+      </w:r>
+      <w:proofErr w:type="spellEnd"/>
+      <w:r>
+        <w:t xml:space="preserve">, </w:t>
+      </w:r>
+      <w:proofErr w:type="spellStart"/>
+      <w:r>
+        <w:t>Execute</w:t>
+      </w:r>
+      <w:proofErr w:type="spellEnd"/>
+      <w:r>
+        <w:t xml:space="preserve"> Workflow, </w:t>
+      </w:r>
+      <w:proofErr w:type="spellStart"/>
+      <w:r>
+        <w:t>Execute</w:t>
+      </w:r>
+      <w:proofErr w:type="spellEnd"/>
+      <w:r>
+        <w:t xml:space="preserve"> Workflow </w:t>
+      </w:r>
+      <w:proofErr w:type="spellStart"/>
+      <w:r>
+        <w:t>Trigger</w:t>
+      </w:r>
+      <w:proofErr w:type="spellEnd"/>
+      <w:r>
+        <w:t xml:space="preserve">, </w:t>
+      </w:r>
+      <w:proofErr w:type="spellStart"/>
+      <w:r>
+        <w:t>Edit</w:t>
+      </w:r>
+      <w:proofErr w:type="spellEnd"/>
+      <w:r>
         <w:t xml:space="preserve"> </w:t>
       </w:r>
       <w:proofErr w:type="spellStart"/>
       <w:r>
+        <w:t>Fields</w:t>
+      </w:r>
+      <w:proofErr w:type="spellEnd"/>
+      <w:r>
+        <w:t xml:space="preserve">, Schedule </w:t>
+      </w:r>
+      <w:proofErr w:type="spellStart"/>
+      <w:r>
+        <w:t>Trigger</w:t>
+      </w:r>
+      <w:proofErr w:type="spellEnd"/>
+      <w:r>
+        <w:t xml:space="preserve">, </w:t>
+      </w:r>
+      <w:proofErr w:type="spellStart"/>
+      <w:r>
+        <w:t>Convert</w:t>
+      </w:r>
+      <w:proofErr w:type="spellEnd"/>
+      <w:r>
+        <w:t xml:space="preserve"> </w:t>
+      </w:r>
+      <w:proofErr w:type="spellStart"/>
+      <w:r>
         <w:t>to</w:t>
       </w:r>
       <w:proofErr w:type="spellEnd"/>
       <w:r>
-        <w:t xml:space="preserve"> </w:t>
+        <w:t xml:space="preserve"> File, </w:t>
       </w:r>
       <w:proofErr w:type="spellStart"/>
       <w:r>
-        <w:t>Webhook</w:t>
+        <w:t>Read</w:t>
       </w:r>
       <w:proofErr w:type="spellEnd"/>
       <w:r>
-        <w:t xml:space="preserve">, </w:t>
+        <w:t>/</w:t>
       </w:r>
       <w:proofErr w:type="spellStart"/>
       <w:r>
-        <w:t>Execute</w:t>
+        <w:t>Write</w:t>
       </w:r>
       <w:proofErr w:type="spellEnd"/>
       <w:r>
-        <w:t xml:space="preserve"> Workflow, </w:t>
+        <w:t xml:space="preserve"> Files </w:t>
       </w:r>
       <w:proofErr w:type="spellStart"/>
       <w:r>
-        <w:t>Execute</w:t>
+        <w:t>from</w:t>
       </w:r>
       <w:proofErr w:type="spellEnd"/>
       <w:r>
-        <w:t xml:space="preserve"> Workflow </w:t>
+        <w:t xml:space="preserve"> Disk y Error </w:t>
       </w:r>
       <w:proofErr w:type="spellStart"/>
       <w:r>
@@ -9153,114 +10123,553 @@
       </w:r>
       <w:proofErr w:type="spellEnd"/>
       <w:r>
-        <w:t xml:space="preserve">, </w:t>
+        <w:t>.</w:t>
+      </w:r>
+    </w:p>
+    <w:p>
+      <w:pPr>
+        <w:pStyle w:val="Ttulo1"/>
+      </w:pPr>
+      <w:r>
+        <w:t xml:space="preserve">6. </w:t>
+      </w:r>
+      <w:r>
+        <w:t>Como Trabajan Juntos</w:t>
+      </w:r>
+    </w:p>
+    <w:p>
+      <w:pPr>
+        <w:pStyle w:val="Prrafodelista"/>
+        <w:numPr>
+          <w:ilvl w:val="0"/>
+          <w:numId w:val="5"/>
+        </w:numPr>
+        <w:spacing w:after="60" w:line="280" w:lineRule="auto"/>
+        <w:contextualSpacing w:val="0"/>
+        <w:jc w:val="both"/>
+      </w:pPr>
+      <w:r>
+        <w:t xml:space="preserve">Una solicitud llega al </w:t>
       </w:r>
       <w:proofErr w:type="spellStart"/>
       <w:r>
-        <w:t>Edit</w:t>
+        <w:t>webhook</w:t>
       </w:r>
       <w:proofErr w:type="spellEnd"/>
       <w:r>
-        <w:t xml:space="preserve"> </w:t>
-      </w:r>
-      <w:proofErr w:type="spellStart"/>
-      <w:r>
-        <w:t>Fields</w:t>
-      </w:r>
-      <w:proofErr w:type="spellEnd"/>
-      <w:r>
-        <w:t xml:space="preserve">, Schedule </w:t>
-      </w:r>
-      <w:proofErr w:type="spellStart"/>
-      <w:r>
-        <w:t>Trigger</w:t>
-      </w:r>
-      <w:proofErr w:type="spellEnd"/>
-      <w:r>
-        <w:t xml:space="preserve">, </w:t>
-      </w:r>
-      <w:proofErr w:type="spellStart"/>
-      <w:r>
-        <w:t>Convert</w:t>
-      </w:r>
-      <w:proofErr w:type="spellEnd"/>
-      <w:r>
-        <w:t xml:space="preserve"> </w:t>
-      </w:r>
-      <w:proofErr w:type="spellStart"/>
-      <w:r>
-        <w:t>to</w:t>
-      </w:r>
-      <w:proofErr w:type="spellEnd"/>
-      <w:r>
-        <w:t xml:space="preserve"> File, </w:t>
-      </w:r>
-      <w:proofErr w:type="spellStart"/>
-      <w:r>
-        <w:t>Read</w:t>
-      </w:r>
-      <w:proofErr w:type="spellEnd"/>
-      <w:r>
-        <w:t>/</w:t>
-      </w:r>
-      <w:proofErr w:type="spellStart"/>
-      <w:r>
-        <w:t>Write</w:t>
-      </w:r>
-      <w:proofErr w:type="spellEnd"/>
-      <w:r>
-        <w:t xml:space="preserve"> Files </w:t>
-      </w:r>
-      <w:proofErr w:type="spellStart"/>
-      <w:r>
-        <w:t>from</w:t>
-      </w:r>
-      <w:proofErr w:type="spellEnd"/>
-      <w:r>
-        <w:t xml:space="preserve"> Disk y Error </w:t>
-      </w:r>
-      <w:proofErr w:type="spellStart"/>
-      <w:r>
-        <w:t>Trigger</w:t>
-      </w:r>
-      <w:proofErr w:type="spellEnd"/>
-      <w:r>
-        <w:t>.</w:t>
-      </w:r>
-    </w:p>
-    <w:p>
-      <w:pPr>
-        <w:pStyle w:val="Ttulo1"/>
-      </w:pPr>
-      <w:r>
-        <w:lastRenderedPageBreak/>
-        <w:t xml:space="preserve">6. </w:t>
-      </w:r>
-      <w:bookmarkStart w:id="18" w:name="_Toc243557576"/>
-      <w:r>
-        <w:t>Manejo de errores y de los datos</w:t>
-      </w:r>
-      <w:bookmarkEnd w:id="18"/>
-    </w:p>
-    <w:p/>
-    <w:p>
-      <w:pPr>
-        <w:pStyle w:val="Ttulo2"/>
-      </w:pPr>
-      <w:bookmarkStart w:id="19" w:name="_Toc243557577"/>
-      <w:r>
-        <w:t>6.1 Errores esperados</w:t>
-      </w:r>
-      <w:bookmarkEnd w:id="19"/>
-    </w:p>
-    <w:p/>
+        <w:t xml:space="preserve"> del WF1 con la clave de acceso.</w:t>
+      </w:r>
+    </w:p>
+    <w:p>
+      <w:pPr>
+        <w:pStyle w:val="Prrafodelista"/>
+        <w:numPr>
+          <w:ilvl w:val="0"/>
+          <w:numId w:val="5"/>
+        </w:numPr>
+        <w:spacing w:after="60" w:line="280" w:lineRule="auto"/>
+        <w:contextualSpacing w:val="0"/>
+        <w:jc w:val="both"/>
+      </w:pPr>
+      <w:r>
+        <w:t>El WF1 valida los datos. Si son inválidos, registra el rechazo y responde 400.</w:t>
+      </w:r>
+    </w:p>
+    <w:p>
+      <w:pPr>
+        <w:pStyle w:val="Prrafodelista"/>
+        <w:numPr>
+          <w:ilvl w:val="0"/>
+          <w:numId w:val="5"/>
+        </w:numPr>
+        <w:spacing w:after="60" w:line="280" w:lineRule="auto"/>
+        <w:contextualSpacing w:val="0"/>
+        <w:jc w:val="both"/>
+      </w:pPr>
+      <w:r>
+        <w:t>Si son válidos, el WF1 llama al WF2, que intenta registrar el préstamo y descontar el stock.</w:t>
+      </w:r>
+    </w:p>
+    <w:p>
+      <w:pPr>
+        <w:pStyle w:val="Prrafodelista"/>
+        <w:numPr>
+          <w:ilvl w:val="0"/>
+          <w:numId w:val="5"/>
+        </w:numPr>
+        <w:spacing w:after="60" w:line="280" w:lineRule="auto"/>
+        <w:contextualSpacing w:val="0"/>
+        <w:jc w:val="both"/>
+      </w:pPr>
+      <w:r>
+        <w:t>El WF2 registra el resultado en la auditoría y lo devuelve al WF1, que responde 201 (aprobado) o 409 (sin stock o equipo inexistente).</w:t>
+      </w:r>
+    </w:p>
+    <w:p>
+      <w:pPr>
+        <w:pStyle w:val="Prrafodelista"/>
+        <w:numPr>
+          <w:ilvl w:val="0"/>
+          <w:numId w:val="5"/>
+        </w:numPr>
+        <w:spacing w:after="60" w:line="280" w:lineRule="auto"/>
+        <w:contextualSpacing w:val="0"/>
+        <w:jc w:val="both"/>
+      </w:pPr>
+      <w:r>
+        <w:t>Cada mañana, el WF3 revisa los préstamos vencidos y genera el reporte.</w:t>
+      </w:r>
+    </w:p>
+    <w:p>
+      <w:pPr>
+        <w:pStyle w:val="Prrafodelista"/>
+        <w:numPr>
+          <w:ilvl w:val="0"/>
+          <w:numId w:val="5"/>
+        </w:numPr>
+        <w:spacing w:after="60" w:line="280" w:lineRule="auto"/>
+        <w:contextualSpacing w:val="0"/>
+        <w:jc w:val="both"/>
+      </w:pPr>
+      <w:r>
+        <w:t xml:space="preserve">Si cualquiera de </w:t>
+      </w:r>
+      <w:proofErr w:type="gramStart"/>
+      <w:r>
+        <w:t>los tres falla</w:t>
+      </w:r>
+      <w:proofErr w:type="gramEnd"/>
+      <w:r>
+        <w:t>, el WF4 registra el error.</w:t>
+      </w:r>
+    </w:p>
+    <w:p>
+      <w:pPr>
+        <w:spacing w:after="60"/>
+      </w:pPr>
+    </w:p>
+    <w:tbl>
+      <w:tblPr>
+        <w:tblW w:w="9360" w:type="dxa"/>
+        <w:tblBorders>
+          <w:top w:val="single" w:sz="4" w:space="0" w:color="auto"/>
+          <w:left w:val="single" w:sz="4" w:space="0" w:color="auto"/>
+          <w:bottom w:val="single" w:sz="4" w:space="0" w:color="auto"/>
+          <w:right w:val="single" w:sz="4" w:space="0" w:color="auto"/>
+          <w:insideH w:val="single" w:sz="4" w:space="0" w:color="auto"/>
+          <w:insideV w:val="single" w:sz="4" w:space="0" w:color="auto"/>
+        </w:tblBorders>
+        <w:tblCellMar>
+          <w:left w:w="10" w:type="dxa"/>
+          <w:right w:w="10" w:type="dxa"/>
+        </w:tblCellMar>
+        <w:tblLook w:val="0000" w:firstRow="0" w:lastRow="0" w:firstColumn="0" w:lastColumn="0" w:noHBand="0" w:noVBand="0"/>
+      </w:tblPr>
+      <w:tblGrid>
+        <w:gridCol w:w="1600"/>
+        <w:gridCol w:w="7760"/>
+      </w:tblGrid>
+      <w:tr>
+        <w:tblPrEx>
+          <w:tblCellMar>
+            <w:top w:w="0" w:type="dxa"/>
+            <w:bottom w:w="0" w:type="dxa"/>
+          </w:tblCellMar>
+        </w:tblPrEx>
+        <w:trPr>
+          <w:tblHeader/>
+        </w:trPr>
+        <w:tc>
+          <w:tcPr>
+            <w:tcW w:w="1600" w:type="dxa"/>
+            <w:tcBorders>
+              <w:top w:val="single" w:sz="4" w:space="0" w:color="BFBFBF"/>
+              <w:left w:val="single" w:sz="4" w:space="0" w:color="BFBFBF"/>
+              <w:bottom w:val="single" w:sz="4" w:space="0" w:color="BFBFBF"/>
+              <w:right w:val="single" w:sz="4" w:space="0" w:color="BFBFBF"/>
+            </w:tcBorders>
+            <w:shd w:val="clear" w:color="auto" w:fill="F6C5AC" w:themeFill="accent2" w:themeFillTint="66"/>
+            <w:tcMar>
+              <w:top w:w="60" w:type="dxa"/>
+              <w:left w:w="100" w:type="dxa"/>
+              <w:bottom w:w="60" w:type="dxa"/>
+              <w:right w:w="100" w:type="dxa"/>
+            </w:tcMar>
+          </w:tcPr>
+          <w:p>
+            <w:pPr>
+              <w:spacing w:line="260" w:lineRule="auto"/>
+            </w:pPr>
+            <w:r>
+              <w:rPr>
+                <w:b/>
+                <w:bCs/>
+                <w:color w:val="FFFFFF"/>
+                <w:sz w:val="19"/>
+                <w:szCs w:val="19"/>
+              </w:rPr>
+              <w:lastRenderedPageBreak/>
+              <w:t>Código</w:t>
+            </w:r>
+          </w:p>
+        </w:tc>
+        <w:tc>
+          <w:tcPr>
+            <w:tcW w:w="7760" w:type="dxa"/>
+            <w:tcBorders>
+              <w:top w:val="single" w:sz="4" w:space="0" w:color="BFBFBF"/>
+              <w:left w:val="single" w:sz="4" w:space="0" w:color="BFBFBF"/>
+              <w:bottom w:val="single" w:sz="4" w:space="0" w:color="BFBFBF"/>
+              <w:right w:val="single" w:sz="4" w:space="0" w:color="BFBFBF"/>
+            </w:tcBorders>
+            <w:shd w:val="clear" w:color="auto" w:fill="F6C5AC" w:themeFill="accent2" w:themeFillTint="66"/>
+            <w:tcMar>
+              <w:top w:w="60" w:type="dxa"/>
+              <w:left w:w="100" w:type="dxa"/>
+              <w:bottom w:w="60" w:type="dxa"/>
+              <w:right w:w="100" w:type="dxa"/>
+            </w:tcMar>
+          </w:tcPr>
+          <w:p>
+            <w:pPr>
+              <w:spacing w:line="260" w:lineRule="auto"/>
+            </w:pPr>
+            <w:r>
+              <w:rPr>
+                <w:b/>
+                <w:bCs/>
+                <w:color w:val="FFFFFF"/>
+                <w:sz w:val="19"/>
+                <w:szCs w:val="19"/>
+              </w:rPr>
+              <w:t>Significado</w:t>
+            </w:r>
+          </w:p>
+        </w:tc>
+      </w:tr>
+      <w:tr>
+        <w:tblPrEx>
+          <w:tblCellMar>
+            <w:top w:w="0" w:type="dxa"/>
+            <w:bottom w:w="0" w:type="dxa"/>
+          </w:tblCellMar>
+        </w:tblPrEx>
+        <w:tc>
+          <w:tcPr>
+            <w:tcW w:w="1600" w:type="dxa"/>
+            <w:tcBorders>
+              <w:top w:val="single" w:sz="4" w:space="0" w:color="BFBFBF"/>
+              <w:left w:val="single" w:sz="4" w:space="0" w:color="BFBFBF"/>
+              <w:bottom w:val="single" w:sz="4" w:space="0" w:color="BFBFBF"/>
+              <w:right w:val="single" w:sz="4" w:space="0" w:color="BFBFBF"/>
+            </w:tcBorders>
+            <w:tcMar>
+              <w:top w:w="60" w:type="dxa"/>
+              <w:left w:w="100" w:type="dxa"/>
+              <w:bottom w:w="60" w:type="dxa"/>
+              <w:right w:w="100" w:type="dxa"/>
+            </w:tcMar>
+          </w:tcPr>
+          <w:p>
+            <w:pPr>
+              <w:spacing w:line="260" w:lineRule="auto"/>
+            </w:pPr>
+            <w:r>
+              <w:rPr>
+                <w:sz w:val="19"/>
+                <w:szCs w:val="19"/>
+              </w:rPr>
+              <w:t>201</w:t>
+            </w:r>
+          </w:p>
+        </w:tc>
+        <w:tc>
+          <w:tcPr>
+            <w:tcW w:w="7760" w:type="dxa"/>
+            <w:tcBorders>
+              <w:top w:val="single" w:sz="4" w:space="0" w:color="BFBFBF"/>
+              <w:left w:val="single" w:sz="4" w:space="0" w:color="BFBFBF"/>
+              <w:bottom w:val="single" w:sz="4" w:space="0" w:color="BFBFBF"/>
+              <w:right w:val="single" w:sz="4" w:space="0" w:color="BFBFBF"/>
+            </w:tcBorders>
+            <w:tcMar>
+              <w:top w:w="60" w:type="dxa"/>
+              <w:left w:w="100" w:type="dxa"/>
+              <w:bottom w:w="60" w:type="dxa"/>
+              <w:right w:w="100" w:type="dxa"/>
+            </w:tcMar>
+          </w:tcPr>
+          <w:p>
+            <w:pPr>
+              <w:spacing w:line="260" w:lineRule="auto"/>
+            </w:pPr>
+            <w:r>
+              <w:rPr>
+                <w:sz w:val="19"/>
+                <w:szCs w:val="19"/>
+              </w:rPr>
+              <w:t>Préstamo aprobado y registrado.</w:t>
+            </w:r>
+          </w:p>
+        </w:tc>
+      </w:tr>
+      <w:tr>
+        <w:tblPrEx>
+          <w:tblCellMar>
+            <w:top w:w="0" w:type="dxa"/>
+            <w:bottom w:w="0" w:type="dxa"/>
+          </w:tblCellMar>
+        </w:tblPrEx>
+        <w:tc>
+          <w:tcPr>
+            <w:tcW w:w="1600" w:type="dxa"/>
+            <w:tcBorders>
+              <w:top w:val="single" w:sz="4" w:space="0" w:color="BFBFBF"/>
+              <w:left w:val="single" w:sz="4" w:space="0" w:color="BFBFBF"/>
+              <w:bottom w:val="single" w:sz="4" w:space="0" w:color="BFBFBF"/>
+              <w:right w:val="single" w:sz="4" w:space="0" w:color="BFBFBF"/>
+            </w:tcBorders>
+            <w:tcMar>
+              <w:top w:w="60" w:type="dxa"/>
+              <w:left w:w="100" w:type="dxa"/>
+              <w:bottom w:w="60" w:type="dxa"/>
+              <w:right w:w="100" w:type="dxa"/>
+            </w:tcMar>
+          </w:tcPr>
+          <w:p>
+            <w:pPr>
+              <w:spacing w:line="260" w:lineRule="auto"/>
+            </w:pPr>
+            <w:r>
+              <w:rPr>
+                <w:sz w:val="19"/>
+                <w:szCs w:val="19"/>
+              </w:rPr>
+              <w:t>400</w:t>
+            </w:r>
+          </w:p>
+        </w:tc>
+        <w:tc>
+          <w:tcPr>
+            <w:tcW w:w="7760" w:type="dxa"/>
+            <w:tcBorders>
+              <w:top w:val="single" w:sz="4" w:space="0" w:color="BFBFBF"/>
+              <w:left w:val="single" w:sz="4" w:space="0" w:color="BFBFBF"/>
+              <w:bottom w:val="single" w:sz="4" w:space="0" w:color="BFBFBF"/>
+              <w:right w:val="single" w:sz="4" w:space="0" w:color="BFBFBF"/>
+            </w:tcBorders>
+            <w:tcMar>
+              <w:top w:w="60" w:type="dxa"/>
+              <w:left w:w="100" w:type="dxa"/>
+              <w:bottom w:w="60" w:type="dxa"/>
+              <w:right w:w="100" w:type="dxa"/>
+            </w:tcMar>
+          </w:tcPr>
+          <w:p>
+            <w:pPr>
+              <w:spacing w:line="260" w:lineRule="auto"/>
+            </w:pPr>
+            <w:r>
+              <w:rPr>
+                <w:sz w:val="19"/>
+                <w:szCs w:val="19"/>
+              </w:rPr>
+              <w:t>Uno o más datos no cumplen las validaciones.</w:t>
+            </w:r>
+          </w:p>
+        </w:tc>
+      </w:tr>
+      <w:tr>
+        <w:tblPrEx>
+          <w:tblCellMar>
+            <w:top w:w="0" w:type="dxa"/>
+            <w:bottom w:w="0" w:type="dxa"/>
+          </w:tblCellMar>
+        </w:tblPrEx>
+        <w:tc>
+          <w:tcPr>
+            <w:tcW w:w="1600" w:type="dxa"/>
+            <w:tcBorders>
+              <w:top w:val="single" w:sz="4" w:space="0" w:color="BFBFBF"/>
+              <w:left w:val="single" w:sz="4" w:space="0" w:color="BFBFBF"/>
+              <w:bottom w:val="single" w:sz="4" w:space="0" w:color="BFBFBF"/>
+              <w:right w:val="single" w:sz="4" w:space="0" w:color="BFBFBF"/>
+            </w:tcBorders>
+            <w:tcMar>
+              <w:top w:w="60" w:type="dxa"/>
+              <w:left w:w="100" w:type="dxa"/>
+              <w:bottom w:w="60" w:type="dxa"/>
+              <w:right w:w="100" w:type="dxa"/>
+            </w:tcMar>
+          </w:tcPr>
+          <w:p>
+            <w:pPr>
+              <w:spacing w:line="260" w:lineRule="auto"/>
+            </w:pPr>
+            <w:r>
+              <w:rPr>
+                <w:sz w:val="19"/>
+                <w:szCs w:val="19"/>
+              </w:rPr>
+              <w:t>403</w:t>
+            </w:r>
+          </w:p>
+        </w:tc>
+        <w:tc>
+          <w:tcPr>
+            <w:tcW w:w="7760" w:type="dxa"/>
+            <w:tcBorders>
+              <w:top w:val="single" w:sz="4" w:space="0" w:color="BFBFBF"/>
+              <w:left w:val="single" w:sz="4" w:space="0" w:color="BFBFBF"/>
+              <w:bottom w:val="single" w:sz="4" w:space="0" w:color="BFBFBF"/>
+              <w:right w:val="single" w:sz="4" w:space="0" w:color="BFBFBF"/>
+            </w:tcBorders>
+            <w:tcMar>
+              <w:top w:w="60" w:type="dxa"/>
+              <w:left w:w="100" w:type="dxa"/>
+              <w:bottom w:w="60" w:type="dxa"/>
+              <w:right w:w="100" w:type="dxa"/>
+            </w:tcMar>
+          </w:tcPr>
+          <w:p>
+            <w:pPr>
+              <w:spacing w:line="260" w:lineRule="auto"/>
+            </w:pPr>
+            <w:r>
+              <w:rPr>
+                <w:sz w:val="19"/>
+                <w:szCs w:val="19"/>
+              </w:rPr>
+              <w:t>Falta la clave X-API-Key o es incorrecta.</w:t>
+            </w:r>
+          </w:p>
+        </w:tc>
+      </w:tr>
+      <w:tr>
+        <w:tblPrEx>
+          <w:tblCellMar>
+            <w:top w:w="0" w:type="dxa"/>
+            <w:bottom w:w="0" w:type="dxa"/>
+          </w:tblCellMar>
+        </w:tblPrEx>
+        <w:tc>
+          <w:tcPr>
+            <w:tcW w:w="1600" w:type="dxa"/>
+            <w:tcBorders>
+              <w:top w:val="single" w:sz="4" w:space="0" w:color="BFBFBF"/>
+              <w:left w:val="single" w:sz="4" w:space="0" w:color="BFBFBF"/>
+              <w:bottom w:val="single" w:sz="4" w:space="0" w:color="BFBFBF"/>
+              <w:right w:val="single" w:sz="4" w:space="0" w:color="BFBFBF"/>
+            </w:tcBorders>
+            <w:tcMar>
+              <w:top w:w="60" w:type="dxa"/>
+              <w:left w:w="100" w:type="dxa"/>
+              <w:bottom w:w="60" w:type="dxa"/>
+              <w:right w:w="100" w:type="dxa"/>
+            </w:tcMar>
+          </w:tcPr>
+          <w:p>
+            <w:pPr>
+              <w:spacing w:line="260" w:lineRule="auto"/>
+            </w:pPr>
+            <w:r>
+              <w:rPr>
+                <w:sz w:val="19"/>
+                <w:szCs w:val="19"/>
+              </w:rPr>
+              <w:t>409</w:t>
+            </w:r>
+          </w:p>
+        </w:tc>
+        <w:tc>
+          <w:tcPr>
+            <w:tcW w:w="7760" w:type="dxa"/>
+            <w:tcBorders>
+              <w:top w:val="single" w:sz="4" w:space="0" w:color="BFBFBF"/>
+              <w:left w:val="single" w:sz="4" w:space="0" w:color="BFBFBF"/>
+              <w:bottom w:val="single" w:sz="4" w:space="0" w:color="BFBFBF"/>
+              <w:right w:val="single" w:sz="4" w:space="0" w:color="BFBFBF"/>
+            </w:tcBorders>
+            <w:tcMar>
+              <w:top w:w="60" w:type="dxa"/>
+              <w:left w:w="100" w:type="dxa"/>
+              <w:bottom w:w="60" w:type="dxa"/>
+              <w:right w:w="100" w:type="dxa"/>
+            </w:tcMar>
+          </w:tcPr>
+          <w:p>
+            <w:pPr>
+              <w:spacing w:line="260" w:lineRule="auto"/>
+            </w:pPr>
+            <w:r>
+              <w:rPr>
+                <w:sz w:val="19"/>
+                <w:szCs w:val="19"/>
+              </w:rPr>
+              <w:t>El equipo no existe, está inactivo o no hay stock suficiente.</w:t>
+            </w:r>
+          </w:p>
+        </w:tc>
+      </w:tr>
+    </w:tbl>
     <w:p>
       <w:pPr>
         <w:spacing w:after="120" w:line="300" w:lineRule="auto"/>
         <w:jc w:val="both"/>
       </w:pPr>
-      <w:r>
-        <w:t>Los errores previsibles se manejan dentro del propio flujo y se responden con el código HTTP estándar que corresponde, para que quien envía la solicitud sepa exactamente qué pasó:</w:t>
+    </w:p>
+    <w:p>
+      <w:pPr>
+        <w:pStyle w:val="Ttulo1"/>
+      </w:pPr>
+      <w:r>
+        <w:t>7</w:t>
+      </w:r>
+      <w:r>
+        <w:t xml:space="preserve">. </w:t>
+      </w:r>
+      <w:bookmarkStart w:id="18" w:name="_Toc243557576"/>
+      <w:r>
+        <w:t>Manejo de errores y de los datos</w:t>
+      </w:r>
+      <w:bookmarkEnd w:id="18"/>
+    </w:p>
+    <w:p/>
+    <w:p>
+      <w:pPr>
+        <w:pStyle w:val="Ttulo2"/>
+      </w:pPr>
+      <w:bookmarkStart w:id="19" w:name="_Toc243557577"/>
+      <w:r>
+        <w:t>7</w:t>
+      </w:r>
+      <w:r>
+        <w:t>.1 Errores esperados</w:t>
+      </w:r>
+      <w:bookmarkEnd w:id="19"/>
+    </w:p>
+    <w:p/>
+    <w:p>
+      <w:pPr>
+        <w:spacing w:after="120" w:line="300" w:lineRule="auto"/>
+        <w:jc w:val="both"/>
+      </w:pPr>
+      <w:r>
+        <w:t xml:space="preserve">Los errores previsibles se </w:t>
+      </w:r>
+      <w:proofErr w:type="spellStart"/>
+      <w:r>
+        <w:t>maneja</w:t>
+      </w:r>
+      <w:r>
+        <w:t>v</w:t>
+      </w:r>
+      <w:r>
+        <w:t>n</w:t>
+      </w:r>
+      <w:proofErr w:type="spellEnd"/>
+      <w:r>
+        <w:t xml:space="preserve"> dentro del propio flujo y se responden con el código HTTP estándar que corresponde, para que quien envía la solicitud sepa exactamente qué pasó:</w:t>
       </w:r>
     </w:p>
     <w:p>
@@ -9763,7 +11172,10 @@
       </w:pPr>
       <w:bookmarkStart w:id="20" w:name="_Toc243557578"/>
       <w:r>
-        <w:t>6.2 Errores inesperados</w:t>
+        <w:t>7</w:t>
+      </w:r>
+      <w:r>
+        <w:t>.2 Errores inesperados</w:t>
       </w:r>
       <w:bookmarkEnd w:id="20"/>
     </w:p>
@@ -9783,7 +11195,10 @@
       </w:pPr>
       <w:bookmarkStart w:id="21" w:name="_Toc243557579"/>
       <w:r>
-        <w:t>6.3 Consistencia de la información</w:t>
+        <w:t>7</w:t>
+      </w:r>
+      <w:r>
+        <w:t>.3 Consistencia de la información</w:t>
       </w:r>
       <w:bookmarkEnd w:id="21"/>
     </w:p>
@@ -9821,35 +11236,14 @@
     </w:p>
     <w:p>
       <w:pPr>
-        <w:spacing w:after="120" w:line="300" w:lineRule="auto"/>
-        <w:jc w:val="both"/>
-      </w:pPr>
-    </w:p>
-    <w:p>
-      <w:pPr>
-        <w:spacing w:after="120" w:line="300" w:lineRule="auto"/>
-        <w:jc w:val="both"/>
-      </w:pPr>
-    </w:p>
-    <w:p>
-      <w:pPr>
-        <w:spacing w:after="120" w:line="300" w:lineRule="auto"/>
-        <w:jc w:val="both"/>
-      </w:pPr>
-    </w:p>
-    <w:p>
-      <w:pPr>
-        <w:spacing w:after="120" w:line="300" w:lineRule="auto"/>
-        <w:jc w:val="both"/>
-      </w:pPr>
-    </w:p>
-    <w:p>
-      <w:pPr>
         <w:pStyle w:val="Ttulo1"/>
       </w:pPr>
       <w:r>
         <w:lastRenderedPageBreak/>
-        <w:t xml:space="preserve">7. </w:t>
+        <w:t>8</w:t>
+      </w:r>
+      <w:r>
+        <w:t xml:space="preserve">. </w:t>
       </w:r>
       <w:bookmarkStart w:id="22" w:name="_Toc243557580"/>
       <w:r>
@@ -11153,7 +12547,7 @@
                     <pic:cNvPicPr/>
                   </pic:nvPicPr>
                   <pic:blipFill>
-                    <a:blip r:embed="rId15"/>
+                    <a:blip r:embed="rId16"/>
                     <a:stretch>
                       <a:fillRect/>
                     </a:stretch>
@@ -11233,7 +12627,7 @@
                     <pic:cNvPicPr/>
                   </pic:nvPicPr>
                   <pic:blipFill>
-                    <a:blip r:embed="rId16"/>
+                    <a:blip r:embed="rId17"/>
                     <a:stretch>
                       <a:fillRect/>
                     </a:stretch>
@@ -11270,7 +12664,10 @@
       </w:pPr>
       <w:bookmarkStart w:id="23" w:name="_Toc243557581"/>
       <w:r>
-        <w:t>8. Pruebas realizadas</w:t>
+        <w:t>9</w:t>
+      </w:r>
+      <w:r>
+        <w:t>. Pruebas realizadas</w:t>
       </w:r>
       <w:bookmarkEnd w:id="23"/>
     </w:p>
@@ -12795,7 +14192,7 @@
                     <pic:cNvPicPr/>
                   </pic:nvPicPr>
                   <pic:blipFill>
-                    <a:blip r:embed="rId17"/>
+                    <a:blip r:embed="rId18"/>
                     <a:stretch>
                       <a:fillRect/>
                     </a:stretch>
@@ -12859,7 +14256,7 @@
                     <pic:cNvPicPr/>
                   </pic:nvPicPr>
                   <pic:blipFill>
-                    <a:blip r:embed="rId17"/>
+                    <a:blip r:embed="rId18"/>
                     <a:stretch>
                       <a:fillRect/>
                     </a:stretch>
@@ -12925,7 +14322,7 @@
                     <pic:cNvPicPr/>
                   </pic:nvPicPr>
                   <pic:blipFill>
-                    <a:blip r:embed="rId18"/>
+                    <a:blip r:embed="rId19"/>
                     <a:stretch>
                       <a:fillRect/>
                     </a:stretch>
@@ -12996,7 +14393,7 @@
                     <pic:cNvPicPr/>
                   </pic:nvPicPr>
                   <pic:blipFill>
-                    <a:blip r:embed="rId19"/>
+                    <a:blip r:embed="rId20"/>
                     <a:stretch>
                       <a:fillRect/>
                     </a:stretch>
@@ -13060,7 +14457,7 @@
                     <pic:cNvPicPr/>
                   </pic:nvPicPr>
                   <pic:blipFill>
-                    <a:blip r:embed="rId20"/>
+                    <a:blip r:embed="rId21"/>
                     <a:stretch>
                       <a:fillRect/>
                     </a:stretch>
@@ -13097,7 +14494,10 @@
       </w:pPr>
       <w:bookmarkStart w:id="24" w:name="_Toc243557582"/>
       <w:r>
-        <w:t>9. Instalación y reproducibilidad</w:t>
+        <w:t>10</w:t>
+      </w:r>
+      <w:r>
+        <w:t>. Instalación y reproducibilidad</w:t>
       </w:r>
       <w:bookmarkEnd w:id="24"/>
     </w:p>
@@ -13267,7 +14667,13 @@
         <w:pStyle w:val="Ttulo1"/>
       </w:pPr>
       <w:r>
-        <w:t>10. Aplicación web de préstamos</w:t>
+        <w:t>1</w:t>
+      </w:r>
+      <w:r>
+        <w:t>1</w:t>
+      </w:r>
+      <w:r>
+        <w:t>. Aplicación web de préstamos</w:t>
       </w:r>
     </w:p>
     <w:p/>
@@ -13293,7 +14699,13 @@
         <w:pStyle w:val="Ttulo2"/>
       </w:pPr>
       <w:r>
-        <w:t>10.1 Tecnologías y arquitectura</w:t>
+        <w:t>1</w:t>
+      </w:r>
+      <w:r>
+        <w:t>1</w:t>
+      </w:r>
+      <w:r>
+        <w:t>.1 Tecnologías y arquitectura</w:t>
       </w:r>
     </w:p>
     <w:p/>
@@ -13971,7 +15383,13 @@
       </w:pPr>
       <w:r>
         <w:lastRenderedPageBreak/>
-        <w:t>10.2 Flujo de una solicitud</w:t>
+        <w:t>1</w:t>
+      </w:r>
+      <w:r>
+        <w:t>1</w:t>
+      </w:r>
+      <w:r>
+        <w:t>.2 Flujo de una solicitud</w:t>
       </w:r>
     </w:p>
     <w:p/>
@@ -14079,6 +15497,9 @@
         </w:rPr>
       </w:pPr>
       <w:r>
+        <w:rPr>
+          <w:noProof/>
+        </w:rPr>
         <w:drawing>
           <wp:inline distT="0" distB="0" distL="0" distR="0" wp14:anchorId="66C36DA9" wp14:editId="415B7B5F">
             <wp:extent cx="5943600" cy="4158615"/>
@@ -14095,7 +15516,7 @@
                     <pic:cNvPicPr/>
                   </pic:nvPicPr>
                   <pic:blipFill>
-                    <a:blip r:embed="rId21"/>
+                    <a:blip r:embed="rId22"/>
                     <a:stretch>
                       <a:fillRect/>
                     </a:stretch>
@@ -14160,7 +15581,7 @@
                     </pic:cNvPicPr>
                   </pic:nvPicPr>
                   <pic:blipFill>
-                    <a:blip r:embed="rId22">
+                    <a:blip r:embed="rId23">
                       <a:extLst>
                         <a:ext uri="{28A0092B-C50C-407E-A947-70E740481C1C}">
                           <a14:useLocalDpi xmlns:a14="http://schemas.microsoft.com/office/drawing/2010/main" val="0"/>
@@ -14207,7 +15628,13 @@
         <w:pStyle w:val="Ttulo2"/>
       </w:pPr>
       <w:r>
-        <w:t>10.3 Seguridad de la aplicación</w:t>
+        <w:t>1</w:t>
+      </w:r>
+      <w:r>
+        <w:t>1</w:t>
+      </w:r>
+      <w:r>
+        <w:t>.3 Seguridad de la aplicación</w:t>
       </w:r>
     </w:p>
     <w:p/>
@@ -14293,7 +15720,13 @@
       </w:pPr>
       <w:r>
         <w:lastRenderedPageBreak/>
-        <w:t>11. Pruebas unitarias automatizadas</w:t>
+        <w:t>1</w:t>
+      </w:r>
+      <w:r>
+        <w:t>2</w:t>
+      </w:r>
+      <w:r>
+        <w:t>. Pruebas unitarias automatizadas</w:t>
       </w:r>
     </w:p>
     <w:p/>
@@ -14333,7 +15766,13 @@
         <w:pStyle w:val="Ttulo2"/>
       </w:pPr>
       <w:r>
-        <w:t>11.1 Herramientas</w:t>
+        <w:t>1</w:t>
+      </w:r>
+      <w:r>
+        <w:t>2</w:t>
+      </w:r>
+      <w:r>
+        <w:t>.1 Herramientas</w:t>
       </w:r>
     </w:p>
     <w:tbl>
@@ -14789,7 +16228,13 @@
         <w:pStyle w:val="Ttulo2"/>
       </w:pPr>
       <w:r>
-        <w:t>11.2 Casos probados</w:t>
+        <w:t>1</w:t>
+      </w:r>
+      <w:r>
+        <w:t>2</w:t>
+      </w:r>
+      <w:r>
+        <w:t>.2 Casos probados</w:t>
       </w:r>
     </w:p>
     <w:tbl>
@@ -15493,7 +16938,13 @@
         <w:pStyle w:val="Ttulo2"/>
       </w:pPr>
       <w:r>
-        <w:t>11.3 Cobertura de código</w:t>
+        <w:t>1</w:t>
+      </w:r>
+      <w:r>
+        <w:t>2</w:t>
+      </w:r>
+      <w:r>
+        <w:t>.3 Cobertura de código</w:t>
       </w:r>
     </w:p>
     <w:p/>
@@ -15972,92 +17423,13 @@
         <w:rPr>
           <w:i/>
           <w:iCs/>
+          <w:noProof/>
         </w:rPr>
         <w:drawing>
           <wp:inline distT="0" distB="0" distL="0" distR="0" wp14:anchorId="52D5370E" wp14:editId="6A171E38">
             <wp:extent cx="6174105" cy="3390676"/>
             <wp:effectExtent l="0" t="0" r="0" b="635"/>
             <wp:docPr id="11" name="Imagen 11"/>
-            <wp:cNvGraphicFramePr>
-              <a:graphicFrameLocks xmlns:a="http://schemas.openxmlformats.org/drawingml/2006/main" noChangeAspect="1"/>
-            </wp:cNvGraphicFramePr>
-            <a:graphic xmlns:a="http://schemas.openxmlformats.org/drawingml/2006/main">
-              <a:graphicData uri="http://schemas.openxmlformats.org/drawingml/2006/picture">
-                <pic:pic xmlns:pic="http://schemas.openxmlformats.org/drawingml/2006/picture">
-                  <pic:nvPicPr>
-                    <pic:cNvPr id="1" name=""/>
-                    <pic:cNvPicPr/>
-                  </pic:nvPicPr>
-                  <pic:blipFill>
-                    <a:blip r:embed="rId23"/>
-                    <a:stretch>
-                      <a:fillRect/>
-                    </a:stretch>
-                  </pic:blipFill>
-                  <pic:spPr>
-                    <a:xfrm>
-                      <a:off x="0" y="0"/>
-                      <a:ext cx="6192915" cy="3401006"/>
-                    </a:xfrm>
-                    <a:prstGeom prst="rect">
-                      <a:avLst/>
-                    </a:prstGeom>
-                  </pic:spPr>
-                </pic:pic>
-              </a:graphicData>
-            </a:graphic>
-          </wp:inline>
-        </w:drawing>
-      </w:r>
-      <w:r>
-        <w:rPr>
-          <w:i/>
-          <w:iCs/>
-          <w:color w:val="595959"/>
-          <w:sz w:val="18"/>
-          <w:szCs w:val="18"/>
-        </w:rPr>
-        <w:t xml:space="preserve">Figura 16. Reporte de cobertura de </w:t>
-      </w:r>
-      <w:proofErr w:type="spellStart"/>
-      <w:r>
-        <w:rPr>
-          <w:i/>
-          <w:iCs/>
-          <w:color w:val="595959"/>
-          <w:sz w:val="18"/>
-          <w:szCs w:val="18"/>
-        </w:rPr>
-        <w:t>JaCoCo</w:t>
-      </w:r>
-      <w:proofErr w:type="spellEnd"/>
-      <w:r>
-        <w:rPr>
-          <w:i/>
-          <w:iCs/>
-          <w:color w:val="595959"/>
-          <w:sz w:val="18"/>
-          <w:szCs w:val="18"/>
-        </w:rPr>
-        <w:t>.</w:t>
-      </w:r>
-    </w:p>
-    <w:p>
-      <w:pPr>
-        <w:spacing w:after="200"/>
-        <w:jc w:val="center"/>
-      </w:pPr>
-      <w:r>
-        <w:rPr>
-          <w:i/>
-          <w:iCs/>
-        </w:rPr>
-        <w:lastRenderedPageBreak/>
-        <w:drawing>
-          <wp:inline distT="0" distB="0" distL="0" distR="0" wp14:anchorId="2E3E9AF7" wp14:editId="4BBCED06">
-            <wp:extent cx="6141720" cy="4381500"/>
-            <wp:effectExtent l="0" t="0" r="0" b="0"/>
-            <wp:docPr id="12" name="Imagen 12"/>
             <wp:cNvGraphicFramePr>
               <a:graphicFrameLocks xmlns:a="http://schemas.openxmlformats.org/drawingml/2006/main" noChangeAspect="1"/>
             </wp:cNvGraphicFramePr>
@@ -16077,6 +17449,87 @@
                   <pic:spPr>
                     <a:xfrm>
                       <a:off x="0" y="0"/>
+                      <a:ext cx="6192915" cy="3401006"/>
+                    </a:xfrm>
+                    <a:prstGeom prst="rect">
+                      <a:avLst/>
+                    </a:prstGeom>
+                  </pic:spPr>
+                </pic:pic>
+              </a:graphicData>
+            </a:graphic>
+          </wp:inline>
+        </w:drawing>
+      </w:r>
+      <w:r>
+        <w:rPr>
+          <w:i/>
+          <w:iCs/>
+          <w:color w:val="595959"/>
+          <w:sz w:val="18"/>
+          <w:szCs w:val="18"/>
+        </w:rPr>
+        <w:t xml:space="preserve">Figura 16. Reporte de cobertura de </w:t>
+      </w:r>
+      <w:proofErr w:type="spellStart"/>
+      <w:r>
+        <w:rPr>
+          <w:i/>
+          <w:iCs/>
+          <w:color w:val="595959"/>
+          <w:sz w:val="18"/>
+          <w:szCs w:val="18"/>
+        </w:rPr>
+        <w:t>JaCoCo</w:t>
+      </w:r>
+      <w:proofErr w:type="spellEnd"/>
+      <w:r>
+        <w:rPr>
+          <w:i/>
+          <w:iCs/>
+          <w:color w:val="595959"/>
+          <w:sz w:val="18"/>
+          <w:szCs w:val="18"/>
+        </w:rPr>
+        <w:t>.</w:t>
+      </w:r>
+    </w:p>
+    <w:p>
+      <w:pPr>
+        <w:spacing w:after="200"/>
+        <w:jc w:val="center"/>
+      </w:pPr>
+      <w:r>
+        <w:rPr>
+          <w:i/>
+          <w:iCs/>
+          <w:noProof/>
+        </w:rPr>
+        <w:lastRenderedPageBreak/>
+        <w:drawing>
+          <wp:inline distT="0" distB="0" distL="0" distR="0" wp14:anchorId="2E3E9AF7" wp14:editId="4BBCED06">
+            <wp:extent cx="6141720" cy="4381500"/>
+            <wp:effectExtent l="0" t="0" r="0" b="0"/>
+            <wp:docPr id="12" name="Imagen 12"/>
+            <wp:cNvGraphicFramePr>
+              <a:graphicFrameLocks xmlns:a="http://schemas.openxmlformats.org/drawingml/2006/main" noChangeAspect="1"/>
+            </wp:cNvGraphicFramePr>
+            <a:graphic xmlns:a="http://schemas.openxmlformats.org/drawingml/2006/main">
+              <a:graphicData uri="http://schemas.openxmlformats.org/drawingml/2006/picture">
+                <pic:pic xmlns:pic="http://schemas.openxmlformats.org/drawingml/2006/picture">
+                  <pic:nvPicPr>
+                    <pic:cNvPr id="1" name=""/>
+                    <pic:cNvPicPr/>
+                  </pic:nvPicPr>
+                  <pic:blipFill>
+                    <a:blip r:embed="rId25"/>
+                    <a:stretch>
+                      <a:fillRect/>
+                    </a:stretch>
+                  </pic:blipFill>
+                  <pic:spPr>
+                    <a:xfrm>
+                      <a:off x="0" y="0"/>
                       <a:ext cx="6145776" cy="4384394"/>
                     </a:xfrm>
                     <a:prstGeom prst="rect">
@@ -16106,7 +17559,13 @@
       </w:pPr>
       <w:bookmarkStart w:id="25" w:name="_Toc243557583"/>
       <w:r>
-        <w:t>12. Conclusiones</w:t>
+        <w:t>1</w:t>
+      </w:r>
+      <w:r>
+        <w:t>3</w:t>
+      </w:r>
+      <w:r>
+        <w:t>. Conclusiones</w:t>
       </w:r>
       <w:bookmarkEnd w:id="25"/>
     </w:p>
@@ -16223,7 +17682,13 @@
       </w:pPr>
       <w:bookmarkStart w:id="26" w:name="_Toc243557584"/>
       <w:r>
-        <w:t>12.1 Trabajo futuro</w:t>
+        <w:t>1</w:t>
+      </w:r>
+      <w:r>
+        <w:t>3</w:t>
+      </w:r>
+      <w:r>
+        <w:t>.1 Trabajo futuro</w:t>
       </w:r>
       <w:bookmarkEnd w:id="26"/>
     </w:p>
@@ -16294,7 +17759,13 @@
       </w:pPr>
       <w:bookmarkStart w:id="27" w:name="_Toc243557585"/>
       <w:r>
-        <w:t>13. Referencias y recursos de apoyo</w:t>
+        <w:t>1</w:t>
+      </w:r>
+      <w:r>
+        <w:t>4</w:t>
+      </w:r>
+      <w:r>
+        <w:t>. Referencias y recursos de apoyo</w:t>
       </w:r>
       <w:bookmarkEnd w:id="27"/>
     </w:p>
@@ -16551,8 +18022,8 @@
     <w:p/>
     <w:p/>
     <w:sectPr>
-      <w:headerReference w:type="default" r:id="rId25"/>
-      <w:footerReference w:type="default" r:id="rId26"/>
+      <w:headerReference w:type="default" r:id="rId26"/>
+      <w:footerReference w:type="default" r:id="rId27"/>
       <w:pgSz w:w="12240" w:h="15840"/>
       <w:pgMar w:top="1440" w:right="1440" w:bottom="1440" w:left="1440" w:header="708" w:footer="708" w:gutter="0"/>
       <w:cols w:space="720"/>
@@ -16888,6 +18359,60 @@
     </w:lvl>
   </w:abstractNum>
   <w:abstractNum w:abstractNumId="3" w15:restartNumberingAfterBreak="0">
+    <w:nsid w:val="7030253E"/>
+    <w:multiLevelType w:val="hybridMultilevel"/>
+    <w:tmpl w:val="ED8215A0"/>
+    <w:lvl w:ilvl="0" w:tplc="DE3A177E">
+      <w:start w:val="1"/>
+      <w:numFmt w:val="decimal"/>
+      <w:lvlText w:val="%1."/>
+      <w:lvlJc w:val="left"/>
+      <w:pPr>
+        <w:ind w:left="720" w:hanging="360"/>
+      </w:pPr>
+    </w:lvl>
+    <w:lvl w:ilvl="1" w:tplc="BB5EA3A0">
+      <w:numFmt w:val="decimal"/>
+      <w:lvlText w:val=""/>
+      <w:lvlJc w:val="left"/>
+    </w:lvl>
+    <w:lvl w:ilvl="2" w:tplc="A1187CD0">
+      <w:numFmt w:val="decimal"/>
+      <w:lvlText w:val=""/>
+      <w:lvlJc w:val="left"/>
+    </w:lvl>
+    <w:lvl w:ilvl="3" w:tplc="AC105A76">
+      <w:numFmt w:val="decimal"/>
+      <w:lvlText w:val=""/>
+      <w:lvlJc w:val="left"/>
+    </w:lvl>
+    <w:lvl w:ilvl="4" w:tplc="EAAC8AB8">
+      <w:numFmt w:val="decimal"/>
+      <w:lvlText w:val=""/>
+      <w:lvlJc w:val="left"/>
+    </w:lvl>
+    <w:lvl w:ilvl="5" w:tplc="5616051C">
+      <w:numFmt w:val="decimal"/>
+      <w:lvlText w:val=""/>
+      <w:lvlJc w:val="left"/>
+    </w:lvl>
+    <w:lvl w:ilvl="6" w:tplc="739ECF86">
+      <w:numFmt w:val="decimal"/>
+      <w:lvlText w:val=""/>
+      <w:lvlJc w:val="left"/>
+    </w:lvl>
+    <w:lvl w:ilvl="7" w:tplc="07A22D26">
+      <w:numFmt w:val="decimal"/>
+      <w:lvlText w:val=""/>
+      <w:lvlJc w:val="left"/>
+    </w:lvl>
+    <w:lvl w:ilvl="8" w:tplc="77A8F7B0">
+      <w:numFmt w:val="decimal"/>
+      <w:lvlText w:val=""/>
+      <w:lvlJc w:val="left"/>
+    </w:lvl>
+  </w:abstractNum>
+  <w:abstractNum w:abstractNumId="4" w15:restartNumberingAfterBreak="0">
     <w:nsid w:val="76A85B02"/>
     <w:multiLevelType w:val="hybridMultilevel"/>
     <w:tmpl w:val="245076C8"/>
@@ -16954,13 +18479,19 @@
     </w:lvlOverride>
   </w:num>
   <w:num w:numId="3" w16cid:durableId="215750579">
-    <w:abstractNumId w:val="3"/>
+    <w:abstractNumId w:val="4"/>
     <w:lvlOverride w:ilvl="0">
       <w:startOverride w:val="1"/>
     </w:lvlOverride>
   </w:num>
   <w:num w:numId="4" w16cid:durableId="1280406000">
     <w:abstractNumId w:val="0"/>
+  </w:num>
+  <w:num w:numId="5" w16cid:durableId="2094886534">
+    <w:abstractNumId w:val="3"/>
+    <w:lvlOverride w:ilvl="0">
+      <w:startOverride w:val="1"/>
+    </w:lvlOverride>
   </w:num>
 </w:numbering>
 </file>

</xml_diff>

<commit_message>
v1.5.1 - Correcciones en el documento técnico
</commit_message>
<xml_diff>
--- a/docs/Documento_Tecnico.docx
+++ b/docs/Documento_Tecnico.docx
@@ -4659,7 +4659,7 @@
         </w:rPr>
         <w:lastRenderedPageBreak/>
         <w:drawing>
-          <wp:anchor distT="0" distB="0" distL="114300" distR="114300" simplePos="0" relativeHeight="251663360" behindDoc="0" locked="0" layoutInCell="1" allowOverlap="1" wp14:anchorId="6511CF6E" wp14:editId="1B2C2C46">
+          <wp:anchor distT="0" distB="0" distL="114300" distR="114300" simplePos="0" relativeHeight="251663360" behindDoc="0" locked="0" layoutInCell="1" allowOverlap="1" wp14:anchorId="6511CF6E" wp14:editId="5C67BABC">
             <wp:simplePos x="0" y="0"/>
             <wp:positionH relativeFrom="column">
               <wp:posOffset>-722503</wp:posOffset>
@@ -22331,34 +22331,10 @@
     </w:p>
     <w:p>
       <w:pPr>
-        <w:pStyle w:val="Prrafodelista"/>
-        <w:numPr>
-          <w:ilvl w:val="0"/>
-          <w:numId w:val="1"/>
-        </w:numPr>
-        <w:spacing w:after="60" w:line="280" w:lineRule="auto"/>
-        <w:contextualSpacing w:val="0"/>
-        <w:jc w:val="both"/>
-      </w:pPr>
-      <w:r>
-        <w:t xml:space="preserve">Se utilizó un asistente de inteligencia artificial (Claude, de </w:t>
-      </w:r>
-      <w:proofErr w:type="spellStart"/>
-      <w:r>
-        <w:t>Anthropic</w:t>
-      </w:r>
-      <w:proofErr w:type="spellEnd"/>
-      <w:r>
-        <w:t>) como apoyo en la guía técnica paso a paso y en la redacción de este documento, conforme al compromiso de dar a conocer los recursos utilizados.</w:t>
-      </w:r>
-    </w:p>
-    <w:p/>
-    <w:p/>
-    <w:p/>
-    <w:p>
-      <w:pPr>
         <w:pStyle w:val="Ttulo1"/>
-        <w:ind w:left="744"/>
+        <w:rPr>
+          <w:lang w:val="en-US"/>
+        </w:rPr>
       </w:pPr>
     </w:p>
     <w:sectPr>

</xml_diff>